<commit_message>
early 2026 resume update
</commit_message>
<xml_diff>
--- a/Leontyev_Alexey.docx
+++ b/Leontyev_Alexey.docx
@@ -2,30 +2,36 @@
 <file path=word/document.xml><?xml version="1.0" encoding="utf-8"?>
 <w:document xmlns:wpc="http://schemas.microsoft.com/office/word/2010/wordprocessingCanvas" xmlns:cx="http://schemas.microsoft.com/office/drawing/2014/chartex" xmlns:cx1="http://schemas.microsoft.com/office/drawing/2015/9/8/chartex" xmlns:cx2="http://schemas.microsoft.com/office/drawing/2015/10/21/chartex" xmlns:cx3="http://schemas.microsoft.com/office/drawing/2016/5/9/chartex" xmlns:cx4="http://schemas.microsoft.com/office/drawing/2016/5/10/chartex" xmlns:cx5="http://schemas.microsoft.com/office/drawing/2016/5/11/chartex" xmlns:cx6="http://schemas.microsoft.com/office/drawing/2016/5/12/chartex" xmlns:cx7="http://schemas.microsoft.com/office/drawing/2016/5/13/chartex" xmlns:cx8="http://schemas.microsoft.com/office/drawing/2016/5/14/chartex" xmlns:mc="http://schemas.openxmlformats.org/markup-compatibility/2006" xmlns:aink="http://schemas.microsoft.com/office/drawing/2016/ink" xmlns:am3d="http://schemas.microsoft.com/office/drawing/2017/model3d" xmlns:o="urn:schemas-microsoft-com:office:office" xmlns:oel="http://schemas.microsoft.com/office/2019/extlst" xmlns:r="http://schemas.openxmlformats.org/officeDocument/2006/relationships" xmlns:m="http://schemas.openxmlformats.org/officeDocument/2006/math" xmlns:v="urn:schemas-microsoft-com:vml" xmlns:wp14="http://schemas.microsoft.com/office/word/2010/wordprocessingDrawing" xmlns:wp="http://schemas.openxmlformats.org/drawingml/2006/wordprocessingDrawing" xmlns:w10="urn:schemas-microsoft-com:office:word" xmlns:w="http://schemas.openxmlformats.org/wordprocessingml/2006/main" xmlns:w14="http://schemas.microsoft.com/office/word/2010/wordml" xmlns:w15="http://schemas.microsoft.com/office/word/2012/wordml" xmlns:w16cex="http://schemas.microsoft.com/office/word/2018/wordml/cex" xmlns:w16cid="http://schemas.microsoft.com/office/word/2016/wordml/cid" xmlns:w16="http://schemas.microsoft.com/office/word/2018/wordml" xmlns:w16sdtdh="http://schemas.microsoft.com/office/word/2020/wordml/sdtdatahash" xmlns:w16se="http://schemas.microsoft.com/office/word/2015/wordml/symex" xmlns:wpg="http://schemas.microsoft.com/office/word/2010/wordprocessingGroup" xmlns:wpi="http://schemas.microsoft.com/office/word/2010/wordprocessingInk" xmlns:wne="http://schemas.microsoft.com/office/word/2006/wordml" xmlns:wps="http://schemas.microsoft.com/office/word/2010/wordprocessingShape" mc:Ignorable="w14 w15 w16se w16cid w16 w16cex w16sdtdh wp14">
   <w:body>
-    <w:p xmlns:wp14="http://schemas.microsoft.com/office/word/2010/wordml" wp14:textId="77777777">
+    <w:p>
       <w:pPr>
         <w:pStyle w:val="Name"/>
       </w:pPr>
       <w:r>
+        <w:rPr/>
         <w:t>ALE</w:t>
       </w:r>
       <w:r>
+        <w:rPr/>
         <w:t>x</w:t>
       </w:r>
       <w:r>
+        <w:rPr/>
         <w:t>EY</w:t>
       </w:r>
       <w:r>
+        <w:rPr/>
         <w:t xml:space="preserve"> leon</w:t>
       </w:r>
       <w:r>
+        <w:rPr/>
         <w:t>ty</w:t>
       </w:r>
       <w:r>
+        <w:rPr/>
         <w:t>ev</w:t>
       </w:r>
     </w:p>
-    <w:p xmlns:wp14="http://schemas.microsoft.com/office/word/2010/wordml" wp14:textId="1D2EBE78">
+    <w:p>
       <w:pPr>
         <w:pStyle w:val="ContactInfo"/>
         <w:rPr>
@@ -36,10 +42,47 @@
         <w:rPr>
           <w:lang w:val="en-US"/>
         </w:rPr>
-        <w:t>Funchal, Portugal</w:t>
-      </w:r>
-    </w:p>
-    <w:p xmlns:wp14="http://schemas.microsoft.com/office/word/2010/wordml" wp14:textId="3A80B506">
+        <w:t>Portugal · Spain</w:t>
+      </w:r>
+      <w:r>
+        <w:rPr>
+          <w:b w:val="1"/>
+          <w:bCs w:val="1"/>
+        </w:rPr>
+        <w:t xml:space="preserve"> </w:t>
+      </w:r>
+      <w:r>
+        <w:rPr>
+          <w:b w:val="0"/>
+          <w:bCs w:val="0"/>
+        </w:rPr>
+        <w:t>·</w:t>
+      </w:r>
+      <w:r>
+        <w:rPr>
+          <w:lang w:val="en-US"/>
+        </w:rPr>
+        <w:t xml:space="preserve"> Worldwide remote</w:t>
+      </w:r>
+    </w:p>
+    <w:p>
+      <w:pPr>
+        <w:pStyle w:val="ContactInfo"/>
+        <w:rPr>
+          <w:lang w:val="en-US"/>
+        </w:rPr>
+      </w:pPr>
+      <w:hyperlink r:id="R4d2ff4191aa947e5">
+        <w:r>
+          <w:rPr>
+            <w:rStyle w:val="Hyperlink"/>
+            <w:lang w:val="en-US"/>
+          </w:rPr>
+          <w:t>https://www.linkedin.com/in/lexleontiev/</w:t>
+        </w:r>
+      </w:hyperlink>
+    </w:p>
+    <w:p>
       <w:pPr>
         <w:pStyle w:val="ContactInfo"/>
         <w:rPr>
@@ -56,7 +99,7 @@
         </w:rPr>
         <w:t>leontiev</w:t>
       </w:r>
-      <w:hyperlink r:id="R0966c53d90754493">
+      <w:hyperlink r:id="R837bd0f946dc4a08">
         <w:r>
           <w:rPr>
             <w:rStyle w:val="Hyperlink"/>
@@ -94,76 +137,383 @@
         </w:r>
       </w:hyperlink>
     </w:p>
-    <w:p xmlns:wp14="http://schemas.microsoft.com/office/word/2010/wordml" wp14:textId="3333D886">
+    <w:p>
       <w:pPr>
         <w:pStyle w:val="ContactInfo"/>
         <w:rPr>
           <w:lang w:val="en-US"/>
         </w:rPr>
       </w:pPr>
-      <w:r>
-        <w:rPr>
-          <w:lang w:val="en-US"/>
-        </w:rPr>
-        <w:t>+</w:t>
-      </w:r>
-      <w:r>
-        <w:rPr>
-          <w:lang w:val="en-US"/>
-        </w:rPr>
-        <w:t>351</w:t>
-      </w:r>
-      <w:r>
-        <w:rPr>
+    </w:p>
+    <w:p xmlns:wp14="http://schemas.microsoft.com/office/word/2010/wordml" wp14:textId="77777777">
+      <w:pPr>
+        <w:pStyle w:val="Heading1"/>
+      </w:pPr>
+      <w:r>
+        <w:rPr>
+          <w:rStyle w:val="Heading1Char"/>
+        </w:rPr>
+        <w:t>SUMM</w:t>
+      </w:r>
+      <w:r>
+        <w:rPr/>
+        <w:t>ARY</w:t>
+      </w:r>
+    </w:p>
+    <w:p>
+      <w:pPr>
+        <w:pStyle w:val="Normal"/>
+        <w:spacing w:before="240" w:beforeAutospacing="off" w:after="240" w:afterAutospacing="off"/>
+        <w:rPr>
+          <w:rFonts w:ascii="Tahoma" w:hAnsi="Tahoma" w:eastAsia="Tahoma" w:cs="Tahoma"/>
+          <w:noProof w:val="0"/>
+          <w:sz w:val="20"/>
+          <w:szCs w:val="20"/>
+          <w:lang w:val="en-US"/>
+        </w:rPr>
+      </w:pPr>
+      <w:r>
+        <w:rPr>
+          <w:rFonts w:ascii="Tahoma" w:hAnsi="Tahoma" w:eastAsia="Tahoma" w:cs="Tahoma"/>
+          <w:b w:val="0"/>
+          <w:bCs w:val="0"/>
+          <w:noProof w:val="0"/>
+          <w:sz w:val="20"/>
+          <w:szCs w:val="20"/>
+          <w:lang w:val="en-US"/>
+        </w:rPr>
+        <w:t xml:space="preserve">AI-powered </w:t>
+      </w:r>
+      <w:r>
+        <w:rPr>
+          <w:rFonts w:ascii="Tahoma" w:hAnsi="Tahoma" w:eastAsia="Tahoma" w:cs="Tahoma"/>
+          <w:b w:val="1"/>
+          <w:bCs w:val="1"/>
+          <w:noProof w:val="0"/>
+          <w:sz w:val="20"/>
+          <w:szCs w:val="20"/>
+          <w:lang w:val="en-US"/>
+        </w:rPr>
+        <w:t>Senior Android Engineer</w:t>
+      </w:r>
+      <w:r>
+        <w:rPr>
+          <w:rFonts w:ascii="Tahoma" w:hAnsi="Tahoma" w:eastAsia="Tahoma" w:cs="Tahoma"/>
+          <w:b w:val="0"/>
+          <w:bCs w:val="0"/>
+          <w:noProof w:val="0"/>
+          <w:sz w:val="20"/>
+          <w:szCs w:val="20"/>
+          <w:lang w:val="en-US"/>
+        </w:rPr>
+        <w:t xml:space="preserve"> with </w:t>
+      </w:r>
+      <w:r>
+        <w:rPr>
+          <w:rFonts w:ascii="Tahoma" w:hAnsi="Tahoma" w:eastAsia="Tahoma" w:cs="Tahoma"/>
+          <w:b w:val="1"/>
+          <w:bCs w:val="1"/>
+          <w:noProof w:val="0"/>
+          <w:sz w:val="20"/>
+          <w:szCs w:val="20"/>
+          <w:lang w:val="en-US"/>
+        </w:rPr>
+        <w:t>10+ years</w:t>
+      </w:r>
+      <w:r>
+        <w:rPr>
+          <w:rFonts w:ascii="Tahoma" w:hAnsi="Tahoma" w:eastAsia="Tahoma" w:cs="Tahoma"/>
+          <w:b w:val="0"/>
+          <w:bCs w:val="0"/>
+          <w:noProof w:val="0"/>
+          <w:sz w:val="20"/>
+          <w:szCs w:val="20"/>
+          <w:lang w:val="en-US"/>
+        </w:rPr>
+        <w:t xml:space="preserve"> of experience delivering high-impact mobile products in fintech, </w:t>
+      </w:r>
+      <w:r>
+        <w:rPr>
+          <w:rFonts w:ascii="Tahoma" w:hAnsi="Tahoma" w:eastAsia="Tahoma" w:cs="Tahoma"/>
+          <w:b w:val="0"/>
+          <w:bCs w:val="0"/>
+          <w:noProof w:val="0"/>
+          <w:sz w:val="20"/>
+          <w:szCs w:val="20"/>
+          <w:lang w:val="en-US"/>
+        </w:rPr>
+        <w:t>video</w:t>
+      </w:r>
+      <w:r>
+        <w:rPr>
+          <w:rFonts w:ascii="Tahoma" w:hAnsi="Tahoma" w:eastAsia="Tahoma" w:cs="Tahoma"/>
+          <w:b w:val="0"/>
+          <w:bCs w:val="0"/>
+          <w:noProof w:val="0"/>
+          <w:sz w:val="20"/>
+          <w:szCs w:val="20"/>
+          <w:lang w:val="en-US"/>
+        </w:rPr>
+        <w:t>,</w:t>
+      </w:r>
+      <w:r>
+        <w:rPr>
+          <w:rFonts w:ascii="Tahoma" w:hAnsi="Tahoma" w:eastAsia="Tahoma" w:cs="Tahoma"/>
+          <w:b w:val="0"/>
+          <w:bCs w:val="0"/>
+          <w:noProof w:val="0"/>
+          <w:sz w:val="20"/>
+          <w:szCs w:val="20"/>
           <w:lang w:val="en-US"/>
         </w:rPr>
         <w:t xml:space="preserve"> </w:t>
       </w:r>
       <w:r>
         <w:rPr>
-          <w:lang w:val="en-US"/>
-        </w:rPr>
-        <w:t>934</w:t>
-      </w:r>
-      <w:r>
-        <w:rPr>
+          <w:rFonts w:ascii="Tahoma" w:hAnsi="Tahoma" w:eastAsia="Tahoma" w:cs="Tahoma"/>
+          <w:b w:val="0"/>
+          <w:bCs w:val="0"/>
+          <w:noProof w:val="0"/>
+          <w:sz w:val="20"/>
+          <w:szCs w:val="20"/>
+          <w:lang w:val="en-US"/>
+        </w:rPr>
+        <w:t xml:space="preserve">and productivity, </w:t>
+      </w:r>
+      <w:r>
+        <w:rPr>
+          <w:rFonts w:ascii="Tahoma" w:hAnsi="Tahoma" w:eastAsia="Tahoma" w:cs="Tahoma"/>
+          <w:b w:val="0"/>
+          <w:bCs w:val="0"/>
+          <w:noProof w:val="0"/>
+          <w:sz w:val="20"/>
+          <w:szCs w:val="20"/>
+          <w:lang w:val="en-US"/>
+        </w:rPr>
+        <w:t xml:space="preserve">including </w:t>
+      </w:r>
+      <w:r>
+        <w:rPr>
+          <w:rFonts w:ascii="Tahoma" w:hAnsi="Tahoma" w:eastAsia="Tahoma" w:cs="Tahoma"/>
+          <w:b w:val="0"/>
+          <w:bCs w:val="0"/>
+          <w:noProof w:val="0"/>
+          <w:sz w:val="20"/>
+          <w:szCs w:val="20"/>
+          <w:lang w:val="en-US"/>
+        </w:rPr>
+        <w:t>apps</w:t>
+      </w:r>
+      <w:r>
+        <w:rPr>
+          <w:rFonts w:ascii="Tahoma" w:hAnsi="Tahoma" w:eastAsia="Tahoma" w:cs="Tahoma"/>
+          <w:b w:val="0"/>
+          <w:bCs w:val="0"/>
+          <w:noProof w:val="0"/>
+          <w:sz w:val="20"/>
+          <w:szCs w:val="20"/>
           <w:lang w:val="en-US"/>
         </w:rPr>
         <w:t xml:space="preserve"> </w:t>
       </w:r>
       <w:r>
         <w:rPr>
-          <w:lang w:val="en-US"/>
-        </w:rPr>
-        <w:t>426 812</w:t>
-      </w:r>
-    </w:p>
-    <w:p xmlns:wp14="http://schemas.microsoft.com/office/word/2010/wordml" wp14:textId="77777777">
-      <w:pPr>
-        <w:pStyle w:val="ContactInfo"/>
-        <w:rPr>
-          <w:rStyle w:val="Heading1Char"/>
-          <w:rFonts w:ascii="Tahoma" w:hAnsi="Tahoma"/>
+          <w:rFonts w:ascii="Tahoma" w:hAnsi="Tahoma" w:eastAsia="Tahoma" w:cs="Tahoma"/>
+          <w:b w:val="0"/>
+          <w:bCs w:val="0"/>
           <w:noProof w:val="0"/>
-          <w:color w:val="auto"/>
           <w:sz w:val="20"/>
-          <w:lang w:val="en-US"/>
-        </w:rPr>
-      </w:pPr>
-    </w:p>
-    <w:p xmlns:wp14="http://schemas.microsoft.com/office/word/2010/wordml" wp14:textId="77777777">
+          <w:szCs w:val="20"/>
+          <w:lang w:val="en-US"/>
+        </w:rPr>
+        <w:t xml:space="preserve">with </w:t>
+      </w:r>
+      <w:r>
+        <w:rPr>
+          <w:rFonts w:ascii="Tahoma" w:hAnsi="Tahoma" w:eastAsia="Tahoma" w:cs="Tahoma"/>
+          <w:b w:val="1"/>
+          <w:bCs w:val="1"/>
+          <w:noProof w:val="0"/>
+          <w:sz w:val="20"/>
+          <w:szCs w:val="20"/>
+          <w:lang w:val="en-US"/>
+        </w:rPr>
+        <w:t>20M+ daily active users</w:t>
+      </w:r>
+      <w:r>
+        <w:rPr>
+          <w:rFonts w:ascii="Tahoma" w:hAnsi="Tahoma" w:eastAsia="Tahoma" w:cs="Tahoma"/>
+          <w:b w:val="0"/>
+          <w:bCs w:val="0"/>
+          <w:noProof w:val="0"/>
+          <w:sz w:val="20"/>
+          <w:szCs w:val="20"/>
+          <w:lang w:val="en-US"/>
+        </w:rPr>
+        <w:t>.</w:t>
+      </w:r>
+      <w:r>
+        <w:rPr>
+          <w:rFonts w:ascii="Tahoma" w:hAnsi="Tahoma" w:eastAsia="Tahoma" w:cs="Tahoma"/>
+          <w:b w:val="0"/>
+          <w:bCs w:val="0"/>
+          <w:noProof w:val="0"/>
+          <w:sz w:val="20"/>
+          <w:szCs w:val="20"/>
+          <w:lang w:val="en-US"/>
+        </w:rPr>
+        <w:t xml:space="preserve"> </w:t>
+      </w:r>
+      <w:r>
+        <w:rPr>
+          <w:rFonts w:ascii="Tahoma" w:hAnsi="Tahoma" w:eastAsia="Tahoma" w:cs="Tahoma"/>
+          <w:b w:val="0"/>
+          <w:bCs w:val="0"/>
+          <w:noProof w:val="0"/>
+          <w:sz w:val="20"/>
+          <w:szCs w:val="20"/>
+          <w:lang w:val="en-US"/>
+        </w:rPr>
+        <w:t>Expert in Kotlin, Jetpack Compose, Coroutines</w:t>
+      </w:r>
+      <w:r>
+        <w:rPr>
+          <w:rFonts w:ascii="Tahoma" w:hAnsi="Tahoma" w:eastAsia="Tahoma" w:cs="Tahoma"/>
+          <w:b w:val="0"/>
+          <w:bCs w:val="0"/>
+          <w:noProof w:val="0"/>
+          <w:sz w:val="20"/>
+          <w:szCs w:val="20"/>
+          <w:lang w:val="en-US"/>
+        </w:rPr>
+        <w:t>/Flow</w:t>
+      </w:r>
+      <w:r>
+        <w:rPr>
+          <w:rFonts w:ascii="Tahoma" w:hAnsi="Tahoma" w:eastAsia="Tahoma" w:cs="Tahoma"/>
+          <w:b w:val="0"/>
+          <w:bCs w:val="0"/>
+          <w:noProof w:val="0"/>
+          <w:sz w:val="20"/>
+          <w:szCs w:val="20"/>
+          <w:lang w:val="en-US"/>
+        </w:rPr>
+        <w:t xml:space="preserve">, and scalable Android architectures, with </w:t>
+      </w:r>
+      <w:r>
+        <w:rPr>
+          <w:rFonts w:ascii="Tahoma" w:hAnsi="Tahoma" w:eastAsia="Tahoma" w:cs="Tahoma"/>
+          <w:b w:val="0"/>
+          <w:bCs w:val="0"/>
+          <w:noProof w:val="0"/>
+          <w:sz w:val="20"/>
+          <w:szCs w:val="20"/>
+          <w:lang w:val="en-US"/>
+        </w:rPr>
+        <w:t>a track record</w:t>
+      </w:r>
+      <w:r>
+        <w:rPr>
+          <w:rFonts w:ascii="Tahoma" w:hAnsi="Tahoma" w:eastAsia="Tahoma" w:cs="Tahoma"/>
+          <w:b w:val="0"/>
+          <w:bCs w:val="0"/>
+          <w:noProof w:val="0"/>
+          <w:sz w:val="20"/>
+          <w:szCs w:val="20"/>
+          <w:lang w:val="en-US"/>
+        </w:rPr>
+        <w:t xml:space="preserve"> of </w:t>
+      </w:r>
+      <w:r>
+        <w:rPr>
+          <w:rFonts w:ascii="Tahoma" w:hAnsi="Tahoma" w:eastAsia="Tahoma" w:cs="Tahoma"/>
+          <w:b w:val="0"/>
+          <w:bCs w:val="0"/>
+          <w:noProof w:val="0"/>
+          <w:sz w:val="20"/>
+          <w:szCs w:val="20"/>
+          <w:lang w:val="en-US"/>
+        </w:rPr>
+        <w:t>improving engagement and business metrics, leading teams, and shipping complex features end-to-end</w:t>
+      </w:r>
+      <w:r>
+        <w:rPr>
+          <w:rFonts w:ascii="Tahoma" w:hAnsi="Tahoma" w:eastAsia="Tahoma" w:cs="Tahoma"/>
+          <w:b w:val="0"/>
+          <w:bCs w:val="0"/>
+          <w:noProof w:val="0"/>
+          <w:sz w:val="20"/>
+          <w:szCs w:val="20"/>
+          <w:lang w:val="en-US"/>
+        </w:rPr>
+        <w:t xml:space="preserve">. </w:t>
+      </w:r>
+      <w:r>
+        <w:rPr>
+          <w:rFonts w:ascii="Tahoma" w:hAnsi="Tahoma" w:eastAsia="Tahoma" w:cs="Tahoma"/>
+          <w:b w:val="0"/>
+          <w:bCs w:val="0"/>
+          <w:noProof w:val="0"/>
+          <w:sz w:val="20"/>
+          <w:szCs w:val="20"/>
+          <w:lang w:val="en-US"/>
+        </w:rPr>
+        <w:t xml:space="preserve">Actively </w:t>
+      </w:r>
+      <w:r>
+        <w:rPr>
+          <w:rFonts w:ascii="Tahoma" w:hAnsi="Tahoma" w:eastAsia="Tahoma" w:cs="Tahoma"/>
+          <w:b w:val="0"/>
+          <w:bCs w:val="0"/>
+          <w:noProof w:val="0"/>
+          <w:sz w:val="20"/>
+          <w:szCs w:val="20"/>
+          <w:lang w:val="en-US"/>
+        </w:rPr>
+        <w:t>leverages</w:t>
+      </w:r>
+      <w:r>
+        <w:rPr>
+          <w:rFonts w:ascii="Tahoma" w:hAnsi="Tahoma" w:eastAsia="Tahoma" w:cs="Tahoma"/>
+          <w:b w:val="0"/>
+          <w:bCs w:val="0"/>
+          <w:noProof w:val="0"/>
+          <w:sz w:val="20"/>
+          <w:szCs w:val="20"/>
+          <w:lang w:val="en-US"/>
+        </w:rPr>
+        <w:t xml:space="preserve"> AI tools (Cursor, Claude Code, multi-agent workflows) to speed up implementation while keeping code quality and reliability high.</w:t>
+      </w:r>
+    </w:p>
+    <w:p>
+      <w:pPr>
+        <w:pStyle w:val="Normal"/>
+        <w:spacing w:before="240" w:beforeAutospacing="off" w:after="240" w:afterAutospacing="off"/>
+        <w:rPr>
+          <w:rFonts w:ascii="Tahoma" w:hAnsi="Tahoma" w:eastAsia="Tahoma" w:cs="Tahoma"/>
+          <w:b w:val="0"/>
+          <w:bCs w:val="0"/>
+          <w:noProof w:val="0"/>
+          <w:sz w:val="20"/>
+          <w:szCs w:val="20"/>
+          <w:lang w:val="en-US"/>
+        </w:rPr>
+      </w:pPr>
+    </w:p>
+    <w:p>
       <w:pPr>
         <w:pStyle w:val="Heading1"/>
-      </w:pPr>
-      <w:r>
-        <w:rPr>
-          <w:rStyle w:val="Heading1Char"/>
-        </w:rPr>
-        <w:t>SUMM</w:t>
-      </w:r>
-      <w:r>
-        <w:rPr/>
-        <w:t>ARY</w:t>
+        <w:rPr>
+          <w:noProof w:val="0"/>
+          <w:lang w:val="en-US"/>
+        </w:rPr>
+      </w:pPr>
+      <w:r>
+        <w:rPr>
+          <w:noProof w:val="0"/>
+          <w:lang w:val="en-US"/>
+        </w:rPr>
+        <w:t>SKILLS</w:t>
       </w:r>
     </w:p>
     <w:p>
@@ -171,25 +521,178 @@
         <w:pStyle w:val="Normal"/>
       </w:pPr>
       <w:r>
-        <w:rPr/>
-        <w:t>Android</w:t>
-      </w:r>
-      <w:r>
-        <w:rPr/>
-        <w:t xml:space="preserve"> Engineer with over 7 years of experience. I specialize in designing and developing stable, functional, and user-friendly </w:t>
-      </w:r>
-      <w:r>
-        <w:rPr/>
-        <w:t xml:space="preserve">mobile </w:t>
-      </w:r>
-      <w:r>
-        <w:rPr/>
-        <w:t>applications. I am also experienced in leading teams and am passionate about organizing people around ambitious goals. My primary motivation is to make a positive impact on the world and improve people's lives.</w:t>
-      </w:r>
-    </w:p>
-    <w:p xmlns:wp14="http://schemas.microsoft.com/office/word/2010/wordml" wp14:textId="49B485C8">
+        <w:rPr>
+          <w:b w:val="1"/>
+          <w:bCs w:val="1"/>
+          <w:i w:val="0"/>
+          <w:iCs w:val="0"/>
+        </w:rPr>
+        <w:t>Programming</w:t>
+      </w:r>
+      <w:r>
+        <w:rPr/>
+        <w:t xml:space="preserve">: Kotlin (Expert), Java (Expert), Swift (Intermediate), C++ (Intermediate), Android SDK, Jetpack Compose, Coroutines/Flow, Room, Hilt/Dagger, Retrofit, Gradle </w:t>
+      </w:r>
+    </w:p>
+    <w:p>
+      <w:pPr>
+        <w:pStyle w:val="Normal"/>
+      </w:pPr>
+      <w:r>
+        <w:rPr>
+          <w:b w:val="1"/>
+          <w:bCs w:val="1"/>
+        </w:rPr>
+        <w:t>Architecture</w:t>
+      </w:r>
+      <w:r>
+        <w:rPr/>
+        <w:t xml:space="preserve">: Clean Architecture, SOLID, System design, TDD, MVVM/MVI/MVP, multi-module projects </w:t>
+      </w:r>
+    </w:p>
+    <w:p>
+      <w:pPr>
+        <w:pStyle w:val="Normal"/>
+      </w:pPr>
+      <w:r>
+        <w:rPr>
+          <w:b w:val="1"/>
+          <w:bCs w:val="1"/>
+        </w:rPr>
+        <w:t>Testing &amp; Automation</w:t>
+      </w:r>
+      <w:r>
+        <w:rPr/>
+        <w:t xml:space="preserve">: Unit &amp; </w:t>
+      </w:r>
+      <w:r>
+        <w:rPr/>
+        <w:t xml:space="preserve">UI </w:t>
+      </w:r>
+      <w:r>
+        <w:rPr/>
+        <w:t>testing</w:t>
+      </w:r>
+      <w:r>
+        <w:rPr/>
+        <w:t xml:space="preserve"> </w:t>
+      </w:r>
+      <w:r>
+        <w:rPr/>
+        <w:t>(</w:t>
+      </w:r>
+      <w:r>
+        <w:rPr/>
+        <w:t>JUnit,</w:t>
+      </w:r>
+      <w:r>
+        <w:rPr/>
+        <w:t xml:space="preserve"> Mockito, Espresso, </w:t>
+      </w:r>
+      <w:r>
+        <w:rPr/>
+        <w:t>Kaspresso</w:t>
+      </w:r>
+      <w:r>
+        <w:rPr/>
+        <w:t>)</w:t>
+      </w:r>
+      <w:r>
+        <w:rPr/>
+        <w:t>, CI/CD (Jenkins, TeamCity), performance &amp; memory profiling</w:t>
+      </w:r>
+    </w:p>
+    <w:p>
+      <w:pPr>
+        <w:pStyle w:val="Normal"/>
+      </w:pPr>
+      <w:r>
+        <w:rPr>
+          <w:b w:val="1"/>
+          <w:bCs w:val="1"/>
+        </w:rPr>
+        <w:t>AI</w:t>
+      </w:r>
+      <w:r>
+        <w:rPr/>
+        <w:t xml:space="preserve">: Cursor, Claude Code, Gemini, multi-agent workflows, cost optimization, </w:t>
+      </w:r>
+      <w:r>
+        <w:rPr/>
+        <w:t xml:space="preserve">rules, </w:t>
+      </w:r>
+      <w:r>
+        <w:rPr/>
+        <w:t>MCP</w:t>
+      </w:r>
+    </w:p>
+    <w:p>
+      <w:pPr>
+        <w:pStyle w:val="Normal"/>
+      </w:pPr>
+      <w:r>
+        <w:rPr>
+          <w:b w:val="1"/>
+          <w:bCs w:val="1"/>
+        </w:rPr>
+        <w:t>Publishing &amp; Analytics</w:t>
+      </w:r>
+      <w:r>
+        <w:rPr/>
+        <w:t>: Play Store publishing (from scratch), release pipeline, A/B experiments, product metrics, crash-free rate, ANR monitoring</w:t>
+      </w:r>
+    </w:p>
+    <w:p>
+      <w:pPr>
+        <w:pStyle w:val="Normal"/>
+      </w:pPr>
+      <w:r>
+        <w:rPr>
+          <w:b w:val="1"/>
+          <w:bCs w:val="1"/>
+        </w:rPr>
+        <w:t>Leadership</w:t>
+      </w:r>
+      <w:r>
+        <w:rPr/>
+        <w:t xml:space="preserve">: </w:t>
+      </w:r>
+      <w:r>
+        <w:rPr/>
+        <w:t>T</w:t>
+      </w:r>
+      <w:r>
+        <w:rPr/>
+        <w:t>eam leadership, mentoring, product ownership, hiring, conflict resolution, public speaking</w:t>
+      </w:r>
+    </w:p>
+    <w:p>
+      <w:pPr>
+        <w:pStyle w:val="Normal"/>
+      </w:pPr>
+      <w:r>
+        <w:rPr>
+          <w:b w:val="1"/>
+          <w:bCs w:val="1"/>
+        </w:rPr>
+        <w:t>Languages</w:t>
+      </w:r>
+      <w:r>
+        <w:rPr/>
+        <w:t>: English (C1), Russian (Native)</w:t>
+      </w:r>
+    </w:p>
+    <w:p>
+      <w:pPr>
+        <w:pStyle w:val="Normal"/>
+      </w:pPr>
+    </w:p>
+    <w:p>
       <w:pPr>
         <w:pStyle w:val="Heading1"/>
+        <w:bidi w:val="0"/>
+        <w:spacing w:before="0" w:beforeAutospacing="off" w:after="0" w:afterAutospacing="off"/>
+        <w:ind/>
       </w:pPr>
       <w:r>
         <w:rPr/>
@@ -200,118 +703,14 @@
         <w:t>EXPERIENCE</w:t>
       </w:r>
     </w:p>
-    <w:p xmlns:wp14="http://schemas.microsoft.com/office/word/2010/wordml" wp14:textId="1E0E1D0D">
-      <w:pPr>
-        <w:rPr>
-          <w:b w:val="1"/>
-          <w:bCs w:val="1"/>
-        </w:rPr>
-      </w:pPr>
-      <w:r>
-        <w:rPr>
-          <w:b w:val="1"/>
-          <w:bCs w:val="1"/>
-        </w:rPr>
-        <w:t>06</w:t>
-      </w:r>
-      <w:r>
-        <w:rPr>
-          <w:b w:val="1"/>
-          <w:bCs w:val="1"/>
-        </w:rPr>
-        <w:t>.202</w:t>
-      </w:r>
-      <w:r>
-        <w:rPr>
-          <w:b w:val="1"/>
-          <w:bCs w:val="1"/>
-        </w:rPr>
-        <w:t>3</w:t>
-      </w:r>
-      <w:r>
-        <w:rPr>
-          <w:b w:val="1"/>
-          <w:bCs w:val="1"/>
-        </w:rPr>
-        <w:t xml:space="preserve"> – 03.202</w:t>
-      </w:r>
-      <w:r>
-        <w:rPr>
-          <w:b w:val="1"/>
-          <w:bCs w:val="1"/>
-        </w:rPr>
-        <w:t>4</w:t>
-      </w:r>
-      <w:r>
-        <w:rPr>
-          <w:b w:val="1"/>
-          <w:bCs w:val="1"/>
-        </w:rPr>
-        <w:t xml:space="preserve"> (</w:t>
-      </w:r>
-      <w:r>
-        <w:rPr>
-          <w:b w:val="1"/>
-          <w:bCs w:val="1"/>
-        </w:rPr>
-        <w:t>10</w:t>
-      </w:r>
-      <w:r>
-        <w:rPr>
-          <w:b w:val="1"/>
-          <w:bCs w:val="1"/>
-        </w:rPr>
-        <w:t xml:space="preserve"> months)</w:t>
-      </w:r>
-      <w:r>
-        <w:rPr>
-          <w:b w:val="1"/>
-          <w:bCs w:val="1"/>
-          <w:lang w:val="en-GB"/>
-        </w:rPr>
-        <w:t>,</w:t>
-      </w:r>
-      <w:r>
-        <w:rPr>
-          <w:b w:val="1"/>
-          <w:bCs w:val="1"/>
-        </w:rPr>
-        <w:t xml:space="preserve"> </w:t>
-      </w:r>
-      <w:r>
-        <w:rPr>
-          <w:b w:val="1"/>
-          <w:bCs w:val="1"/>
-        </w:rPr>
-        <w:t>GoGoals</w:t>
-      </w:r>
-      <w:r>
-        <w:rPr>
-          <w:b w:val="1"/>
-          <w:bCs w:val="1"/>
-        </w:rPr>
-        <w:t xml:space="preserve"> (AI-powered task management app)</w:t>
-      </w:r>
-      <w:r>
-        <w:rPr>
-          <w:b w:val="1"/>
-          <w:bCs w:val="1"/>
-        </w:rPr>
-        <w:t xml:space="preserve">, </w:t>
-      </w:r>
-      <w:r>
-        <w:rPr>
-          <w:b w:val="1"/>
-          <w:bCs w:val="1"/>
-        </w:rPr>
-        <w:t>Funchal</w:t>
-      </w:r>
-    </w:p>
     <w:p>
       <w:pPr>
         <w:pStyle w:val="Normal"/>
-        <w:suppressLineNumbers w:val="0"/>
-        <w:bidi w:val="0"/>
+      </w:pPr>
+    </w:p>
+    <w:p>
+      <w:pPr>
+        <w:pStyle w:val="Normal"/>
         <w:spacing w:before="0" w:beforeAutospacing="off" w:after="200" w:afterAutospacing="off" w:line="276" w:lineRule="auto"/>
         <w:ind w:left="0" w:right="0"/>
         <w:jc w:val="left"/>
@@ -325,17 +724,141 @@
           <w:b w:val="1"/>
           <w:bCs w:val="1"/>
         </w:rPr>
-        <w:t>Founder</w:t>
+        <w:t>Revolut (</w:t>
+      </w:r>
+      <w:r>
+        <w:rPr>
+          <w:b w:val="1"/>
+          <w:bCs w:val="1"/>
+        </w:rPr>
+        <w:t>f</w:t>
+      </w:r>
+      <w:r>
+        <w:rPr>
+          <w:b w:val="1"/>
+          <w:bCs w:val="1"/>
+        </w:rPr>
+        <w:t xml:space="preserve">intech) </w:t>
+      </w:r>
+      <w:r>
+        <w:rPr>
+          <w:b w:val="1"/>
+          <w:bCs w:val="1"/>
+        </w:rPr>
+        <w:t xml:space="preserve">· </w:t>
+      </w:r>
+      <w:r>
+        <w:rPr>
+          <w:b w:val="1"/>
+          <w:bCs w:val="1"/>
+        </w:rPr>
+        <w:t>0</w:t>
+      </w:r>
+      <w:r>
+        <w:rPr>
+          <w:b w:val="1"/>
+          <w:bCs w:val="1"/>
+        </w:rPr>
+        <w:t>5</w:t>
+      </w:r>
+      <w:r>
+        <w:rPr>
+          <w:b w:val="1"/>
+          <w:bCs w:val="1"/>
+        </w:rPr>
+        <w:t>.202</w:t>
+      </w:r>
+      <w:r>
+        <w:rPr>
+          <w:b w:val="1"/>
+          <w:bCs w:val="1"/>
+        </w:rPr>
+        <w:t>5</w:t>
+      </w:r>
+      <w:r>
+        <w:rPr>
+          <w:b w:val="1"/>
+          <w:bCs w:val="1"/>
+        </w:rPr>
+        <w:t xml:space="preserve"> – Present</w:t>
+      </w:r>
+      <w:r>
+        <w:rPr>
+          <w:b w:val="1"/>
+          <w:bCs w:val="1"/>
+        </w:rPr>
+        <w:t xml:space="preserve"> </w:t>
+      </w:r>
+      <w:r>
+        <w:rPr>
+          <w:b w:val="1"/>
+          <w:bCs w:val="1"/>
+        </w:rPr>
+        <w:t>·</w:t>
+      </w:r>
+      <w:r>
+        <w:rPr>
+          <w:b w:val="1"/>
+          <w:bCs w:val="1"/>
+        </w:rPr>
+        <w:t xml:space="preserve"> Android Engineer · </w:t>
+      </w:r>
+      <w:r>
+        <w:rPr>
+          <w:b w:val="1"/>
+          <w:bCs w:val="1"/>
+        </w:rPr>
+        <w:t>Portugal (remote)</w:t>
       </w:r>
     </w:p>
     <w:p>
       <w:pPr>
-        <w:pStyle w:val="ListParagraph"/>
-        <w:rPr/>
-      </w:pPr>
-      <w:r>
-        <w:rPr/>
-        <w:t>Conducted market and competitor analysis,</w:t>
+        <w:pStyle w:val="Bullet2"/>
+        <w:rPr/>
+      </w:pPr>
+      <w:r>
+        <w:rPr/>
+        <w:t xml:space="preserve">Building a </w:t>
+      </w:r>
+      <w:r>
+        <w:rPr/>
+        <w:t xml:space="preserve">new </w:t>
+      </w:r>
+      <w:r>
+        <w:rPr/>
+        <w:t>scalable business banking Android product from scratch (Kotlin, Coroutines, Flow).</w:t>
+      </w:r>
+    </w:p>
+    <w:p>
+      <w:pPr>
+        <w:pStyle w:val="Bullet2"/>
+        <w:rPr/>
+      </w:pPr>
+      <w:r>
+        <w:rPr/>
+        <w:t>Working in a small, fast-paced cross-functional team, owning features from discovery to release.</w:t>
+      </w:r>
+    </w:p>
+    <w:p>
+      <w:pPr>
+        <w:pStyle w:val="Bullet2"/>
+        <w:rPr/>
+      </w:pPr>
+      <w:r>
+        <w:rPr/>
+        <w:t xml:space="preserve">Actively </w:t>
+      </w:r>
+      <w:r>
+        <w:rPr/>
+        <w:t>leveraging</w:t>
+      </w:r>
+      <w:r>
+        <w:rPr/>
+        <w:t xml:space="preserve"> AI tools to speed up </w:t>
+      </w:r>
+      <w:r>
+        <w:rPr/>
+        <w:t>delivery</w:t>
       </w:r>
       <w:r>
         <w:rPr/>
@@ -343,847 +866,524 @@
       </w:r>
       <w:r>
         <w:rPr/>
-        <w:t>collaborated</w:t>
-      </w:r>
-      <w:r>
-        <w:rPr/>
-        <w:t xml:space="preserve"> with product managers, designers, and analysts to refine user experience and functionality</w:t>
+        <w:t xml:space="preserve">while </w:t>
+      </w:r>
+      <w:r>
+        <w:rPr/>
+        <w:t>maint</w:t>
+      </w:r>
+      <w:r>
+        <w:rPr/>
+        <w:t>aining</w:t>
+      </w:r>
+      <w:r>
+        <w:rPr/>
+        <w:t xml:space="preserve"> high coverage and stability</w:t>
+      </w:r>
+      <w:r>
+        <w:rPr/>
+        <w:t>.</w:t>
+      </w:r>
+      <w:r>
+        <w:br/>
       </w:r>
     </w:p>
     <w:p>
       <w:pPr>
-        <w:pStyle w:val="ListParagraph"/>
-        <w:rPr/>
-      </w:pPr>
-      <w:r>
-        <w:rPr>
-          <w:noProof w:val="0"/>
-          <w:lang w:val="en-US"/>
-        </w:rPr>
-        <w:t xml:space="preserve">Built a website and developed an Android app, </w:t>
-      </w:r>
-      <w:r>
-        <w:rPr>
-          <w:noProof w:val="0"/>
-          <w:lang w:val="en-US"/>
-        </w:rPr>
-        <w:t>initiating</w:t>
-      </w:r>
-      <w:r>
-        <w:rPr>
-          <w:noProof w:val="0"/>
-          <w:lang w:val="en-US"/>
-        </w:rPr>
-        <w:t xml:space="preserve"> real user testing.</w:t>
+        <w:pStyle w:val="Normal"/>
+        <w:spacing w:before="0" w:beforeAutospacing="off" w:after="200" w:afterAutospacing="off" w:line="276" w:lineRule="auto"/>
+        <w:ind w:left="0" w:right="0"/>
+        <w:jc w:val="left"/>
+        <w:rPr>
+          <w:b w:val="1"/>
+          <w:bCs w:val="1"/>
+        </w:rPr>
+      </w:pPr>
+      <w:r>
+        <w:rPr>
+          <w:b w:val="1"/>
+          <w:bCs w:val="1"/>
+        </w:rPr>
+        <w:t xml:space="preserve">Avalanche (marketplace) · 07.2024 – 02.2025 · </w:t>
+      </w:r>
+      <w:r>
+        <w:rPr>
+          <w:b w:val="1"/>
+          <w:bCs w:val="1"/>
+        </w:rPr>
+        <w:t xml:space="preserve">Senior </w:t>
+      </w:r>
+      <w:r>
+        <w:rPr>
+          <w:b w:val="1"/>
+          <w:bCs w:val="1"/>
+        </w:rPr>
+        <w:t>Android Engineer · Portugal</w:t>
       </w:r>
     </w:p>
     <w:p>
       <w:pPr>
-        <w:pStyle w:val="ListParagraph"/>
-        <w:suppressLineNumbers w:val="0"/>
-        <w:bidi w:val="0"/>
-        <w:spacing w:before="240" w:beforeAutospacing="off" w:after="240" w:afterAutospacing="off" w:line="276" w:lineRule="auto"/>
-        <w:ind w:left="1080" w:right="0" w:hanging="360"/>
-        <w:jc w:val="left"/>
-        <w:rPr>
-          <w:noProof w:val="0"/>
-          <w:lang w:val="en-US"/>
-        </w:rPr>
-      </w:pPr>
-      <w:r>
-        <w:rPr>
-          <w:noProof w:val="0"/>
-          <w:lang w:val="en-US"/>
-        </w:rPr>
-        <w:t>Launched successful advertising campaigns, presented the project to incubators, accelerators, and investors</w:t>
+        <w:pStyle w:val="Bullet2"/>
+        <w:rPr/>
+      </w:pPr>
+      <w:r>
+        <w:rPr/>
+        <w:t xml:space="preserve">Worked on a React Native-based marketplace </w:t>
+      </w:r>
+      <w:r>
+        <w:rPr/>
+        <w:t>assistance</w:t>
+      </w:r>
+      <w:r>
+        <w:rPr/>
+        <w:t xml:space="preserve"> app, ensuring robust integration and data flow between native Android and JS code. </w:t>
       </w:r>
     </w:p>
     <w:p>
       <w:pPr>
-        <w:rPr>
-          <w:b w:val="1"/>
-          <w:bCs w:val="1"/>
-        </w:rPr>
-      </w:pPr>
-      <w:r>
-        <w:rPr>
-          <w:b w:val="1"/>
-          <w:bCs w:val="1"/>
-        </w:rPr>
-        <w:t>11.2020 – 03.2023 (2 years 6 months)</w:t>
-      </w:r>
-      <w:r>
-        <w:rPr>
-          <w:b w:val="1"/>
-          <w:bCs w:val="1"/>
-          <w:lang w:val="en-GB"/>
-        </w:rPr>
-        <w:t>,</w:t>
-      </w:r>
-      <w:r>
-        <w:rPr>
-          <w:b w:val="1"/>
-          <w:bCs w:val="1"/>
-        </w:rPr>
-        <w:t xml:space="preserve"> Dzen (Video Android Development Group), Moscow</w:t>
-      </w:r>
-    </w:p>
-    <w:p>
-      <w:r>
-        <w:rPr>
-          <w:b w:val="1"/>
-          <w:bCs w:val="1"/>
-        </w:rPr>
-        <w:t>Team Leader</w:t>
-      </w:r>
-    </w:p>
-    <w:p>
-      <w:pPr>
-        <w:pStyle w:val="ListParagraph"/>
-        <w:rPr/>
-      </w:pPr>
-      <w:r>
-        <w:rPr/>
-        <w:t>Managing/Hiring/Consulting of a team of android developers (5-8 employees)</w:t>
-      </w:r>
-    </w:p>
-    <w:p>
-      <w:pPr>
-        <w:pStyle w:val="ListParagraph"/>
-        <w:rPr/>
-      </w:pPr>
-      <w:r>
-        <w:rPr/>
-        <w:t>Designing an efficient video handling system</w:t>
-      </w:r>
-    </w:p>
-    <w:p>
-      <w:pPr>
-        <w:pStyle w:val="ListParagraph"/>
-        <w:rPr/>
-      </w:pPr>
-      <w:r>
-        <w:rPr/>
-        <w:t>Implementing custom component system for embedding video layouts across the app</w:t>
-      </w:r>
-    </w:p>
-    <w:p xmlns:wp14="http://schemas.microsoft.com/office/word/2010/wordml" wp14:textId="77777777">
-      <w:pPr>
-        <w:rPr>
-          <w:b/>
-          <w:lang w:val="ru-RU"/>
-        </w:rPr>
-      </w:pPr>
-    </w:p>
-    <w:p xmlns:wp14="http://schemas.microsoft.com/office/word/2010/wordml" wp14:textId="12E34C00">
-      <w:pPr>
-        <w:rPr>
-          <w:b w:val="1"/>
-          <w:bCs w:val="1"/>
-        </w:rPr>
-      </w:pPr>
-      <w:r>
-        <w:rPr>
-          <w:b w:val="1"/>
-          <w:bCs w:val="1"/>
-        </w:rPr>
-        <w:t>04.2019 – 11.2020 (1 year 8 months)</w:t>
-      </w:r>
-      <w:r>
-        <w:rPr>
-          <w:b w:val="1"/>
-          <w:bCs w:val="1"/>
-          <w:lang w:val="en-GB"/>
-        </w:rPr>
-        <w:t>,</w:t>
-      </w:r>
-      <w:r>
-        <w:rPr>
-          <w:b w:val="1"/>
-          <w:bCs w:val="1"/>
-        </w:rPr>
-        <w:t xml:space="preserve"> </w:t>
-      </w:r>
-      <w:bookmarkStart w:name="_Int_9Qq9ZFLL" w:id="290913572"/>
-      <w:r>
-        <w:rPr>
-          <w:b w:val="1"/>
-          <w:bCs w:val="1"/>
-        </w:rPr>
-        <w:t>Yandex.Zen</w:t>
-      </w:r>
-      <w:bookmarkEnd w:id="290913572"/>
-      <w:r>
-        <w:rPr>
-          <w:b w:val="1"/>
-          <w:bCs w:val="1"/>
-        </w:rPr>
-        <w:t>/</w:t>
-      </w:r>
-      <w:bookmarkStart w:name="_Int_bfXIaYJo" w:id="2029809265"/>
-      <w:r>
-        <w:rPr>
-          <w:b w:val="1"/>
-          <w:bCs w:val="1"/>
-        </w:rPr>
-        <w:t>Sloy</w:t>
-      </w:r>
-      <w:bookmarkEnd w:id="2029809265"/>
-      <w:r>
-        <w:rPr>
-          <w:b w:val="1"/>
-          <w:bCs w:val="1"/>
-        </w:rPr>
-        <w:t xml:space="preserve"> (Fashion AR startup), Moscow</w:t>
-      </w:r>
-    </w:p>
-    <w:p xmlns:wp14="http://schemas.microsoft.com/office/word/2010/wordml" wp14:textId="77777777">
-      <w:r>
-        <w:rPr>
-          <w:b/>
-        </w:rPr>
-        <w:t>Android Developer</w:t>
-      </w:r>
-      <w:r>
-        <w:rPr>
-          <w:b/>
-        </w:rPr>
-        <w:t xml:space="preserve"> </w:t>
-      </w:r>
-    </w:p>
-    <w:p xmlns:wp14="http://schemas.microsoft.com/office/word/2010/wordml" wp14:textId="77777777">
-      <w:pPr>
-        <w:pStyle w:val="ListParagraph"/>
-        <w:rPr/>
-      </w:pPr>
-      <w:r>
-        <w:rPr/>
-        <w:t>Us</w:t>
-      </w:r>
-      <w:r>
-        <w:rPr/>
-        <w:t>ed</w:t>
-      </w:r>
-      <w:r>
-        <w:rPr/>
-        <w:t xml:space="preserve"> Clean Architecture</w:t>
-      </w:r>
-      <w:r>
-        <w:rPr/>
-        <w:t xml:space="preserve"> and </w:t>
-      </w:r>
-      <w:r>
-        <w:rPr>
-          <w:lang w:val="en-GB"/>
-        </w:rPr>
-        <w:t xml:space="preserve">approach </w:t>
-      </w:r>
-      <w:r>
-        <w:rPr>
-          <w:lang w:val="en-GB"/>
-        </w:rPr>
-        <w:t xml:space="preserve">and </w:t>
-      </w:r>
-      <w:r>
-        <w:rPr/>
-        <w:t>multi-module system</w:t>
-      </w:r>
-      <w:r>
-        <w:rPr/>
-        <w:t xml:space="preserve"> </w:t>
-      </w:r>
-      <w:r>
-        <w:rPr>
-          <w:lang w:val="en-GB"/>
-        </w:rPr>
-        <w:t>in application design</w:t>
-      </w:r>
-    </w:p>
-    <w:p xmlns:wp14="http://schemas.microsoft.com/office/word/2010/wordml" wp14:textId="13295CF4">
-      <w:pPr>
-        <w:pStyle w:val="ListParagraph"/>
-        <w:ind/>
-        <w:rPr>
-          <w:lang w:val="en-GB"/>
-        </w:rPr>
-      </w:pPr>
-      <w:r>
-        <w:rPr>
-          <w:lang w:val="en-GB"/>
-        </w:rPr>
-        <w:t>Us</w:t>
-      </w:r>
-      <w:r>
-        <w:rPr>
-          <w:lang w:val="en-GB"/>
-        </w:rPr>
-        <w:t>ed</w:t>
-      </w:r>
-      <w:r>
-        <w:rPr>
-          <w:lang w:val="en-GB"/>
-        </w:rPr>
-        <w:t xml:space="preserve"> MV</w:t>
-      </w:r>
-      <w:r>
-        <w:rPr>
-          <w:lang w:val="en-GB"/>
-        </w:rPr>
-        <w:t>VM</w:t>
-      </w:r>
-      <w:r>
-        <w:rPr>
-          <w:lang w:val="en-GB"/>
-        </w:rPr>
-        <w:t>/</w:t>
-      </w:r>
-      <w:r>
-        <w:rPr/>
-        <w:t>MVP</w:t>
-      </w:r>
-      <w:r>
-        <w:rPr>
-          <w:lang w:val="en-GB"/>
-        </w:rPr>
-        <w:t xml:space="preserve"> in UI layer</w:t>
-      </w:r>
-    </w:p>
-    <w:p xmlns:wp14="http://schemas.microsoft.com/office/word/2010/wordml" wp14:textId="438DBD36">
-      <w:pPr>
-        <w:pStyle w:val="Normal"/>
-        <w:rPr>
-          <w:rFonts w:ascii="Tahoma" w:hAnsi="Tahoma" w:eastAsia="Century Schoolbook" w:cs="Century Schoolbook"/>
-          <w:color w:val="39302B"/>
-          <w:lang w:val="en-GB"/>
-        </w:rPr>
-      </w:pPr>
-    </w:p>
-    <w:p xmlns:wp14="http://schemas.microsoft.com/office/word/2010/wordml" wp14:textId="77777777">
-      <w:pPr>
-        <w:rPr>
-          <w:b w:val="1"/>
-          <w:bCs w:val="1"/>
-        </w:rPr>
-      </w:pPr>
-      <w:r>
-        <w:rPr>
-          <w:b w:val="1"/>
-          <w:bCs w:val="1"/>
-        </w:rPr>
-        <w:t xml:space="preserve">02.2017 – </w:t>
-      </w:r>
-      <w:r>
-        <w:rPr>
-          <w:b w:val="1"/>
-          <w:bCs w:val="1"/>
-        </w:rPr>
-        <w:t>04.2019</w:t>
-      </w:r>
-      <w:r>
-        <w:rPr>
-          <w:b w:val="1"/>
-          <w:bCs w:val="1"/>
-        </w:rPr>
-        <w:t xml:space="preserve"> </w:t>
-      </w:r>
-      <w:r>
-        <w:rPr>
-          <w:b w:val="1"/>
-          <w:bCs w:val="1"/>
-        </w:rPr>
-        <w:t>(2 years 2 months)</w:t>
-      </w:r>
-      <w:r>
-        <w:rPr>
-          <w:b w:val="1"/>
-          <w:bCs w:val="1"/>
-          <w:lang w:val="en-GB"/>
-        </w:rPr>
-        <w:t>,</w:t>
-      </w:r>
-      <w:r>
-        <w:rPr>
-          <w:b w:val="1"/>
-          <w:bCs w:val="1"/>
-        </w:rPr>
-        <w:t xml:space="preserve"> </w:t>
-      </w:r>
-      <w:bookmarkStart w:name="_Int_Ce9C55h7" w:id="791645991"/>
-      <w:r>
-        <w:rPr>
-          <w:b w:val="1"/>
-          <w:bCs w:val="1"/>
-        </w:rPr>
-        <w:t>Visitech</w:t>
-      </w:r>
-      <w:bookmarkEnd w:id="791645991"/>
-      <w:r>
-        <w:rPr>
-          <w:b w:val="1"/>
-          <w:bCs w:val="1"/>
-        </w:rPr>
-        <w:t xml:space="preserve"> (</w:t>
-      </w:r>
-      <w:r>
-        <w:rPr>
-          <w:b w:val="1"/>
-          <w:bCs w:val="1"/>
-        </w:rPr>
-        <w:t>integrated safe system of work</w:t>
-      </w:r>
-      <w:r>
-        <w:rPr>
-          <w:b w:val="1"/>
-          <w:bCs w:val="1"/>
-        </w:rPr>
-        <w:t>), Moscow</w:t>
-      </w:r>
-    </w:p>
-    <w:p xmlns:wp14="http://schemas.microsoft.com/office/word/2010/wordml" wp14:textId="77777777">
-      <w:r>
-        <w:rPr>
-          <w:b/>
-        </w:rPr>
-        <w:t>Android Developer</w:t>
-      </w:r>
-    </w:p>
-    <w:p xmlns:wp14="http://schemas.microsoft.com/office/word/2010/wordml" wp14:textId="77777777">
-      <w:pPr>
-        <w:pStyle w:val="ListParagraph"/>
-        <w:rPr/>
-      </w:pPr>
-      <w:r>
-        <w:rPr>
-          <w:lang w:val="en-GB"/>
-        </w:rPr>
-        <w:t>Develo</w:t>
-      </w:r>
-      <w:r>
-        <w:rPr>
-          <w:lang w:val="en-GB"/>
-        </w:rPr>
-        <w:t>ped</w:t>
-      </w:r>
-      <w:r>
-        <w:rPr>
-          <w:lang w:val="en-GB"/>
-        </w:rPr>
-        <w:t xml:space="preserve"> from scratch</w:t>
-      </w:r>
-      <w:r>
-        <w:rPr/>
-        <w:t xml:space="preserve"> </w:t>
-      </w:r>
-      <w:r>
-        <w:rPr/>
-        <w:t>b2b application</w:t>
-      </w:r>
-    </w:p>
-    <w:p xmlns:wp14="http://schemas.microsoft.com/office/word/2010/wordml" wp14:textId="77777777">
-      <w:pPr>
-        <w:pStyle w:val="ListParagraph"/>
-        <w:rPr/>
-      </w:pPr>
-      <w:r>
-        <w:rPr>
-          <w:lang w:val="en-GB"/>
-        </w:rPr>
-        <w:t>Work</w:t>
-      </w:r>
-      <w:r>
-        <w:rPr>
-          <w:lang w:val="en-GB"/>
-        </w:rPr>
-        <w:t>ed</w:t>
-      </w:r>
-      <w:r>
-        <w:rPr>
-          <w:lang w:val="en-GB"/>
-        </w:rPr>
-        <w:t xml:space="preserve"> with</w:t>
-      </w:r>
-      <w:r>
-        <w:rPr/>
-        <w:t xml:space="preserve"> </w:t>
-      </w:r>
-      <w:bookmarkStart w:name="_Int_hCXHdMwI" w:id="196163068"/>
-      <w:r>
-        <w:rPr/>
-        <w:t>OkHttp</w:t>
-      </w:r>
-      <w:bookmarkEnd w:id="196163068"/>
-      <w:r>
-        <w:rPr/>
-        <w:t xml:space="preserve">, </w:t>
-      </w:r>
-      <w:bookmarkStart w:name="_Int_SjnBwaPP" w:id="72252023"/>
-      <w:r>
-        <w:rPr/>
-        <w:t>ButterKnife</w:t>
-      </w:r>
-      <w:bookmarkEnd w:id="72252023"/>
-      <w:r>
-        <w:rPr/>
-        <w:t xml:space="preserve">, </w:t>
-      </w:r>
-      <w:bookmarkStart w:name="_Int_RvPZRFgA" w:id="1694152008"/>
-      <w:r>
-        <w:rPr/>
-        <w:t>Gson</w:t>
-      </w:r>
-      <w:bookmarkEnd w:id="1694152008"/>
-      <w:r>
-        <w:rPr/>
-        <w:t xml:space="preserve">, </w:t>
-      </w:r>
-      <w:r>
-        <w:rPr/>
-        <w:t>AutoValue libraries</w:t>
-      </w:r>
-      <w:r>
-        <w:rPr/>
-        <w:t>, used Kotlin together with Java</w:t>
-      </w:r>
-    </w:p>
-    <w:p>
-      <w:pPr>
-        <w:pStyle w:val="ListParagraph"/>
-        <w:rPr/>
-      </w:pPr>
-      <w:r>
-        <w:rPr/>
-        <w:t>Implemented</w:t>
-      </w:r>
-      <w:r>
-        <w:rPr/>
-        <w:t xml:space="preserve"> </w:t>
-      </w:r>
-      <w:r>
-        <w:rPr/>
-        <w:t xml:space="preserve">custom push notifications based on </w:t>
-      </w:r>
-      <w:r>
-        <w:rPr/>
-        <w:t>web sockets</w:t>
-      </w:r>
-    </w:p>
-    <w:p xmlns:wp14="http://schemas.microsoft.com/office/word/2010/wordml" wp14:textId="11C4C6DC">
-      <w:pPr>
-        <w:pStyle w:val="Heading1"/>
-        <w:rPr>
-          <w:noProof w:val="0"/>
-          <w:lang w:val="en-US"/>
-        </w:rPr>
-      </w:pPr>
-      <w:r>
-        <w:rPr>
-          <w:noProof w:val="0"/>
-          <w:lang w:val="en-US"/>
-        </w:rPr>
-        <w:t>PROJECTS</w:t>
-      </w:r>
-    </w:p>
-    <w:p xmlns:wp14="http://schemas.microsoft.com/office/word/2010/wordml" wp14:textId="77777777">
-      <w:pPr>
-        <w:rPr>
-          <w:b/>
-          <w:bCs/>
-        </w:rPr>
-      </w:pPr>
-      <w:r>
-        <w:rPr>
-          <w:b/>
-          <w:bCs/>
-        </w:rPr>
-        <w:t>04.2018 – 05.2018, Karma Auth (document recognition), Moscow</w:t>
-      </w:r>
-    </w:p>
-    <w:p xmlns:wp14="http://schemas.microsoft.com/office/word/2010/wordml" wp14:textId="77777777">
-      <w:pPr>
-        <w:rPr>
-          <w:b/>
-        </w:rPr>
-      </w:pPr>
-      <w:r>
-        <w:rPr>
-          <w:b/>
-        </w:rPr>
-        <w:t>Android Developer</w:t>
-      </w:r>
-    </w:p>
-    <w:p xmlns:wp14="http://schemas.microsoft.com/office/word/2010/wordml" wp14:textId="2A80FF79">
-      <w:pPr>
-        <w:pStyle w:val="ListParagraph"/>
-        <w:rPr/>
-      </w:pPr>
-      <w:r>
-        <w:rPr/>
-        <w:t xml:space="preserve">Creation of android application prototype for </w:t>
-      </w:r>
-      <w:r>
-        <w:rPr>
-          <w:lang w:val="en-GB"/>
-        </w:rPr>
-        <w:t>recognition documents, using Google Vision and OpenCV,</w:t>
-      </w:r>
-      <w:r>
-        <w:rPr/>
-        <w:t xml:space="preserve"> in</w:t>
-      </w:r>
-      <w:r>
-        <w:rPr>
-          <w:lang w:val="en-GB"/>
-        </w:rPr>
-        <w:t xml:space="preserve"> frame of</w:t>
-      </w:r>
-      <w:r>
-        <w:rPr/>
-        <w:t xml:space="preserve"> IT Competition – Karma </w:t>
-      </w:r>
-      <w:r>
-        <w:rPr/>
-        <w:t>Hackathon</w:t>
-      </w:r>
-    </w:p>
-    <w:p xmlns:wp14="http://schemas.microsoft.com/office/word/2010/wordml" wp14:textId="77777777">
-      <w:pPr>
-        <w:rPr>
-          <w:lang w:eastAsia="x-none"/>
-        </w:rPr>
-      </w:pPr>
-    </w:p>
-    <w:p xmlns:wp14="http://schemas.microsoft.com/office/word/2010/wordml" wp14:textId="77777777">
-      <w:pPr>
-        <w:rPr>
-          <w:b w:val="1"/>
-          <w:bCs w:val="1"/>
-        </w:rPr>
-      </w:pPr>
-      <w:r>
-        <w:rPr>
-          <w:b w:val="1"/>
-          <w:bCs w:val="1"/>
-        </w:rPr>
-        <w:t>06.2015 – 11.2015, Artera (</w:t>
-      </w:r>
-      <w:bookmarkStart w:name="_Int_iHlMEdWl" w:id="621300109"/>
-      <w:r>
-        <w:rPr>
-          <w:b w:val="1"/>
-          <w:bCs w:val="1"/>
-        </w:rPr>
-        <w:t>audioguide</w:t>
-      </w:r>
-      <w:bookmarkEnd w:id="621300109"/>
-      <w:r>
-        <w:rPr>
-          <w:b w:val="1"/>
-          <w:bCs w:val="1"/>
-        </w:rPr>
-        <w:t xml:space="preserve"> listening service), Moscow</w:t>
-      </w:r>
-    </w:p>
-    <w:p xmlns:wp14="http://schemas.microsoft.com/office/word/2010/wordml" wp14:textId="77777777">
-      <w:r>
-        <w:rPr>
-          <w:b/>
-        </w:rPr>
-        <w:t>Android Developer</w:t>
-      </w:r>
-    </w:p>
-    <w:p xmlns:wp14="http://schemas.microsoft.com/office/word/2010/wordml" wp14:textId="77777777">
-      <w:pPr>
-        <w:pStyle w:val="ListParagraph"/>
-        <w:rPr/>
-      </w:pPr>
-      <w:r>
-        <w:rPr/>
-        <w:t xml:space="preserve">Development of </w:t>
-      </w:r>
-      <w:r>
-        <w:rPr>
-          <w:lang w:val="en-GB"/>
-        </w:rPr>
-        <w:t>software f</w:t>
-      </w:r>
-      <w:r>
-        <w:rPr/>
-        <w:t>or museums and art-objects audio-guides</w:t>
-      </w:r>
-    </w:p>
-    <w:p xmlns:wp14="http://schemas.microsoft.com/office/word/2010/wordml" wp14:textId="71DD8569">
-      <w:pPr>
-        <w:pStyle w:val="ListParagraph"/>
-        <w:rPr/>
-      </w:pPr>
-      <w:r>
-        <w:rPr/>
-        <w:t>Creation of android application prototype in</w:t>
-      </w:r>
-      <w:r>
-        <w:rPr>
-          <w:lang w:val="en-GB"/>
-        </w:rPr>
-        <w:t xml:space="preserve"> frame of</w:t>
-      </w:r>
-      <w:r>
-        <w:rPr/>
-        <w:t xml:space="preserve"> IT </w:t>
-      </w:r>
-      <w:r>
-        <w:rPr/>
-        <w:t>Startup</w:t>
-      </w:r>
-      <w:r>
-        <w:rPr/>
-        <w:t xml:space="preserve"> Competition – </w:t>
-      </w:r>
-      <w:bookmarkStart w:name="_Int_q17XhmEW" w:id="1732994946"/>
-      <w:r>
-        <w:rPr/>
-        <w:t>Technostart</w:t>
-      </w:r>
-      <w:bookmarkEnd w:id="1732994946"/>
-      <w:r>
-        <w:rPr/>
-        <w:t xml:space="preserve"> 2015 (provided by </w:t>
-      </w:r>
-      <w:bookmarkStart w:name="_Int_FCcjCsXH" w:id="1928093850"/>
-      <w:r>
-        <w:rPr/>
-        <w:t>Mail.Ru</w:t>
-      </w:r>
-      <w:bookmarkEnd w:id="1928093850"/>
-      <w:r>
-        <w:rPr/>
-        <w:t xml:space="preserve"> Group), the app was awarded with </w:t>
-      </w:r>
-      <w:r>
-        <w:rPr>
-          <w:lang w:val="en-GB"/>
-        </w:rPr>
-        <w:t xml:space="preserve">a </w:t>
-      </w:r>
-      <w:r>
-        <w:rPr/>
-        <w:t>grant.</w:t>
-      </w:r>
-    </w:p>
-    <w:p xmlns:wp14="http://schemas.microsoft.com/office/word/2010/wordml" wp14:textId="77777777">
-      <w:pPr>
-        <w:pStyle w:val="ListParagraph"/>
-        <w:rPr/>
-      </w:pPr>
-      <w:r>
-        <w:rPr/>
-        <w:t>Realization of indoor location in museums with iBeacon and Eddystone technologies</w:t>
-      </w:r>
-    </w:p>
-    <w:p xmlns:wp14="http://schemas.microsoft.com/office/word/2010/wordml" wp14:textId="77777777">
-      <w:pPr>
-        <w:pStyle w:val="ListParagraph"/>
+        <w:pStyle w:val="Bullet2"/>
         <w:numPr>
           <w:ilvl w:val="0"/>
           <w:numId w:val="0"/>
         </w:numPr>
-        <w:ind w:left="1080"/>
-      </w:pPr>
-    </w:p>
-    <w:p xmlns:wp14="http://schemas.microsoft.com/office/word/2010/wordml" wp14:textId="77777777">
-      <w:pPr>
-        <w:rPr>
-          <w:b w:val="1"/>
-          <w:bCs w:val="1"/>
-          <w:lang w:val="en-GB"/>
-        </w:rPr>
-      </w:pPr>
-      <w:r>
-        <w:rPr>
-          <w:b w:val="1"/>
-          <w:bCs w:val="1"/>
-        </w:rPr>
-        <w:t xml:space="preserve">02.2015 – 06.2015, </w:t>
-      </w:r>
-      <w:bookmarkStart w:name="_Int_jxDHwEQz" w:id="1353284918"/>
-      <w:r>
-        <w:rPr>
-          <w:b w:val="1"/>
-          <w:bCs w:val="1"/>
-        </w:rPr>
-        <w:t>Musix</w:t>
-      </w:r>
-      <w:bookmarkEnd w:id="1353284918"/>
-      <w:r>
-        <w:rPr>
-          <w:b w:val="1"/>
-          <w:bCs w:val="1"/>
-        </w:rPr>
-        <w:t xml:space="preserve"> (music streaming service), Moscow</w:t>
-      </w:r>
-    </w:p>
-    <w:p xmlns:wp14="http://schemas.microsoft.com/office/word/2010/wordml" wp14:textId="77777777">
-      <w:r>
-        <w:rPr>
-          <w:b w:val="1"/>
-          <w:bCs w:val="1"/>
-        </w:rPr>
-        <w:t>C++/</w:t>
-      </w:r>
-      <w:bookmarkStart w:name="_Int_cj6PQbAE" w:id="1132661398"/>
-      <w:r>
-        <w:rPr>
-          <w:b w:val="1"/>
-          <w:bCs w:val="1"/>
-        </w:rPr>
-        <w:t>Qml</w:t>
-      </w:r>
-      <w:bookmarkEnd w:id="1132661398"/>
-      <w:r>
-        <w:rPr>
-          <w:b w:val="1"/>
-          <w:bCs w:val="1"/>
-        </w:rPr>
-        <w:t xml:space="preserve"> Developer</w:t>
-      </w:r>
-    </w:p>
-    <w:p xmlns:wp14="http://schemas.microsoft.com/office/word/2010/wordml" wp14:textId="77777777">
-      <w:pPr>
-        <w:pStyle w:val="ListParagraph"/>
-        <w:rPr/>
-      </w:pPr>
-      <w:r>
-        <w:rPr/>
-        <w:t xml:space="preserve">Development of cross-platform app for free music listening with QT framework </w:t>
-      </w:r>
-    </w:p>
-    <w:p xmlns:wp14="http://schemas.microsoft.com/office/word/2010/wordml" wp14:textId="77777777">
-      <w:pPr>
-        <w:pStyle w:val="ListParagraph"/>
-        <w:rPr/>
-      </w:pPr>
-      <w:r>
-        <w:rPr/>
-        <w:t>Implement</w:t>
-      </w:r>
-      <w:r>
-        <w:rPr>
-          <w:lang w:val="en-GB"/>
-        </w:rPr>
-        <w:t xml:space="preserve"> of</w:t>
-      </w:r>
-      <w:r>
-        <w:rPr/>
-        <w:t xml:space="preserve"> adaptive UI in all supported platforms with Qml (developed by Qt)</w:t>
-      </w:r>
-    </w:p>
-    <w:p xmlns:wp14="http://schemas.microsoft.com/office/word/2010/wordml" wp14:textId="77777777">
-      <w:pPr>
-        <w:pStyle w:val="ListParagraph"/>
+        <w:ind w:left="0"/>
+      </w:pPr>
+    </w:p>
+    <w:p>
+      <w:pPr>
+        <w:pStyle w:val="Bullet2"/>
         <w:numPr>
           <w:ilvl w:val="0"/>
           <w:numId w:val="0"/>
         </w:numPr>
-        <w:ind w:left="720"/>
+        <w:ind w:left="0"/>
+      </w:pPr>
+    </w:p>
+    <w:p>
+      <w:pPr>
+        <w:pStyle w:val="Normal"/>
+        <w:spacing w:before="0" w:beforeAutospacing="off" w:after="200" w:afterAutospacing="off" w:line="276" w:lineRule="auto"/>
+        <w:ind w:left="0" w:right="0"/>
+        <w:jc w:val="left"/>
+        <w:rPr>
+          <w:b w:val="1"/>
+          <w:bCs w:val="1"/>
+          <w:noProof w:val="0"/>
+          <w:lang w:val="en-US"/>
+        </w:rPr>
+      </w:pPr>
+      <w:r>
+        <w:rPr>
+          <w:b w:val="1"/>
+          <w:bCs w:val="1"/>
+        </w:rPr>
+        <w:t>GoGoals</w:t>
+      </w:r>
+      <w:r>
+        <w:rPr>
+          <w:b w:val="1"/>
+          <w:bCs w:val="1"/>
+        </w:rPr>
+        <w:t xml:space="preserve"> (</w:t>
+      </w:r>
+      <w:r>
+        <w:rPr>
+          <w:b w:val="1"/>
+          <w:bCs w:val="1"/>
+        </w:rPr>
+        <w:t>productivity) · 06.2023 – 0</w:t>
+      </w:r>
+      <w:r>
+        <w:rPr>
+          <w:b w:val="1"/>
+          <w:bCs w:val="1"/>
+        </w:rPr>
+        <w:t>7</w:t>
+      </w:r>
+      <w:r>
+        <w:rPr>
+          <w:b w:val="1"/>
+          <w:bCs w:val="1"/>
+        </w:rPr>
+        <w:t xml:space="preserve">.2024 · </w:t>
+      </w:r>
+      <w:r>
+        <w:rPr>
+          <w:rFonts w:ascii="Tahoma" w:hAnsi="Tahoma" w:eastAsia="Century Schoolbook" w:cs="Century Schoolbook"/>
+          <w:b w:val="1"/>
+          <w:bCs w:val="1"/>
+          <w:i w:val="0"/>
+          <w:iCs w:val="0"/>
+          <w:caps w:val="0"/>
+          <w:smallCaps w:val="0"/>
+          <w:noProof w:val="0"/>
+          <w:color w:val="39302B"/>
+          <w:lang w:val="en-US"/>
+        </w:rPr>
+        <w:t xml:space="preserve">Founder / </w:t>
+      </w:r>
+      <w:r>
+        <w:rPr>
+          <w:b w:val="1"/>
+          <w:bCs w:val="1"/>
+        </w:rPr>
+        <w:t xml:space="preserve">Senior </w:t>
+      </w:r>
+      <w:r>
+        <w:rPr>
+          <w:rFonts w:ascii="Tahoma" w:hAnsi="Tahoma" w:eastAsia="Century Schoolbook" w:cs="Century Schoolbook"/>
+          <w:b w:val="1"/>
+          <w:bCs w:val="1"/>
+          <w:i w:val="0"/>
+          <w:iCs w:val="0"/>
+          <w:caps w:val="0"/>
+          <w:smallCaps w:val="0"/>
+          <w:noProof w:val="0"/>
+          <w:color w:val="39302B"/>
+          <w:lang w:val="en-US"/>
+        </w:rPr>
+        <w:t>Android Engineer</w:t>
+      </w:r>
+      <w:r>
+        <w:rPr>
+          <w:b w:val="1"/>
+          <w:bCs w:val="1"/>
+        </w:rPr>
+        <w:t xml:space="preserve"> · Portugal</w:t>
+      </w:r>
+    </w:p>
+    <w:p xmlns:wp14="http://schemas.microsoft.com/office/word/2010/wordml" wp14:textId="1455CF90">
+      <w:pPr>
+        <w:pStyle w:val="Bullet2"/>
+        <w:rPr/>
+      </w:pPr>
+      <w:r>
+        <w:rPr/>
+        <w:t xml:space="preserve">Bootstrapped a B2C </w:t>
+      </w:r>
+      <w:r>
+        <w:rPr/>
+        <w:t>product</w:t>
+      </w:r>
+      <w:r>
+        <w:rPr/>
+        <w:t xml:space="preserve"> (AI-powered task management app)</w:t>
+      </w:r>
+      <w:r>
+        <w:rPr/>
+        <w:t xml:space="preserve"> from</w:t>
+      </w:r>
+      <w:r>
+        <w:rPr/>
+        <w:t xml:space="preserve"> idea to live Android app on Google Play</w:t>
+      </w:r>
+      <w:r>
+        <w:rPr/>
+        <w:t>: conducted</w:t>
+      </w:r>
+      <w:r>
+        <w:rPr/>
+        <w:t xml:space="preserve"> market and competitor research, defined MVP scope, and built the app using modern Android stack. </w:t>
+      </w:r>
+    </w:p>
+    <w:p xmlns:wp14="http://schemas.microsoft.com/office/word/2010/wordml" wp14:textId="5724F29D">
+      <w:pPr>
+        <w:pStyle w:val="Bullet2"/>
+        <w:rPr/>
+      </w:pPr>
+      <w:r>
+        <w:rPr/>
+        <w:t xml:space="preserve">Set up analytics and real-user testing loops to </w:t>
+      </w:r>
+      <w:r>
+        <w:rPr/>
+        <w:t>validate</w:t>
+      </w:r>
+      <w:r>
+        <w:rPr/>
+        <w:t xml:space="preserve"> product decisions and improve retention. </w:t>
+      </w:r>
+    </w:p>
+    <w:p xmlns:wp14="http://schemas.microsoft.com/office/word/2010/wordml" wp14:textId="28A89D0A">
+      <w:pPr>
+        <w:pStyle w:val="Bullet2"/>
+        <w:rPr/>
+      </w:pPr>
+      <w:r>
+        <w:rPr/>
+        <w:t xml:space="preserve">Launched advertising campaigns to </w:t>
+      </w:r>
+      <w:r>
+        <w:rPr/>
+        <w:t>acquire</w:t>
+      </w:r>
+      <w:r>
+        <w:rPr/>
+        <w:t xml:space="preserve"> early users and pitched the project to incubators.</w:t>
+      </w:r>
+    </w:p>
+    <w:p xmlns:wp14="http://schemas.microsoft.com/office/word/2010/wordml" wp14:textId="15362B53">
+      <w:pPr>
+        <w:pStyle w:val="Bullet2"/>
+        <w:numPr>
+          <w:ilvl w:val="0"/>
+          <w:numId w:val="0"/>
+        </w:numPr>
+        <w:ind w:left="490"/>
+      </w:pPr>
+    </w:p>
+    <w:p xmlns:wp14="http://schemas.microsoft.com/office/word/2010/wordml" wp14:textId="6EAF09BE">
+      <w:pPr>
+        <w:pStyle w:val="Normal"/>
+        <w:rPr>
+          <w:b w:val="1"/>
+          <w:bCs w:val="1"/>
+          <w:lang w:val="ru-RU"/>
+        </w:rPr>
+      </w:pPr>
+      <w:r>
+        <w:rPr>
+          <w:b w:val="1"/>
+          <w:bCs w:val="1"/>
+        </w:rPr>
+        <w:t xml:space="preserve">Yandex (video/browser) · 11.2020 – 03.2023 · Team Leader / </w:t>
+      </w:r>
+      <w:r>
+        <w:rPr>
+          <w:b w:val="1"/>
+          <w:bCs w:val="1"/>
+        </w:rPr>
+        <w:t xml:space="preserve">Senior </w:t>
+      </w:r>
+      <w:r>
+        <w:rPr>
+          <w:b w:val="1"/>
+          <w:bCs w:val="1"/>
+        </w:rPr>
+        <w:t>Android Engineer</w:t>
+      </w:r>
+      <w:r>
+        <w:rPr>
+          <w:b w:val="1"/>
+          <w:bCs w:val="1"/>
+        </w:rPr>
+        <w:t xml:space="preserve"> · Russia</w:t>
+      </w:r>
+    </w:p>
+    <w:p xmlns:wp14="http://schemas.microsoft.com/office/word/2010/wordml" wp14:textId="4D21FDFD">
+      <w:pPr>
+        <w:pStyle w:val="Bullet2"/>
+        <w:rPr/>
+      </w:pPr>
+      <w:r>
+        <w:rPr/>
+        <w:t xml:space="preserve">Led the Android video team (8 engineers) responsible for video features in </w:t>
+      </w:r>
+      <w:r>
+        <w:rPr/>
+        <w:t>Yandex.Zen</w:t>
+      </w:r>
+      <w:r>
+        <w:rPr/>
+        <w:t xml:space="preserve"> and integrations into Yandex Search and Yandex Browser with 20M+ daily active users.</w:t>
+      </w:r>
+    </w:p>
+    <w:p xmlns:wp14="http://schemas.microsoft.com/office/word/2010/wordml" wp14:textId="0EA49FE6">
+      <w:pPr>
+        <w:pStyle w:val="Bullet2"/>
+        <w:rPr/>
+      </w:pPr>
+      <w:r>
+        <w:rPr/>
+        <w:t>Increased average user time spent on video content from ~5% to ~50%, making video the most viewed content type in the apps.</w:t>
+      </w:r>
+    </w:p>
+    <w:p xmlns:wp14="http://schemas.microsoft.com/office/word/2010/wordml" wp14:textId="3FFD36D1">
+      <w:pPr>
+        <w:pStyle w:val="Bullet2"/>
+        <w:rPr/>
+      </w:pPr>
+      <w:r>
+        <w:rPr/>
+        <w:t xml:space="preserve">Designed an efficient </w:t>
+      </w:r>
+      <w:r>
+        <w:rPr/>
+        <w:t>component</w:t>
+      </w:r>
+      <w:r>
+        <w:rPr/>
+        <w:t xml:space="preserve"> system for embedding video layouts across the app.</w:t>
+      </w:r>
+    </w:p>
+    <w:p xmlns:wp14="http://schemas.microsoft.com/office/word/2010/wordml" wp14:textId="24983DF2">
+      <w:pPr>
+        <w:pStyle w:val="Bullet2"/>
+        <w:numPr>
+          <w:ilvl w:val="0"/>
+          <w:numId w:val="0"/>
+        </w:numPr>
+        <w:ind w:left="490"/>
+      </w:pPr>
+    </w:p>
+    <w:p xmlns:wp14="http://schemas.microsoft.com/office/word/2010/wordml" wp14:textId="6AC4DF41">
+      <w:pPr>
+        <w:pStyle w:val="Normal"/>
+        <w:rPr>
+          <w:b w:val="1"/>
+          <w:bCs w:val="1"/>
+        </w:rPr>
+      </w:pPr>
+      <w:r>
+        <w:rPr>
+          <w:b w:val="1"/>
+          <w:bCs w:val="1"/>
+        </w:rPr>
+        <w:t>Yandex (video/AR) · 04.2019 – 11.2020 · Android Engineer · Russia</w:t>
+      </w:r>
+    </w:p>
+    <w:p>
+      <w:pPr>
+        <w:pStyle w:val="Bullet2"/>
+        <w:rPr>
+          <w:noProof w:val="0"/>
+          <w:lang w:val="en-US"/>
+        </w:rPr>
+      </w:pPr>
+      <w:r>
+        <w:rPr>
+          <w:noProof w:val="0"/>
+          <w:lang w:val="en-US"/>
+        </w:rPr>
+        <w:t>Built and led a small Android team for a fashion AR startup (Sloy) and released the app in stealth mode within 9 months.</w:t>
+      </w:r>
+    </w:p>
+    <w:p>
+      <w:pPr>
+        <w:pStyle w:val="Bullet2"/>
+        <w:rPr>
+          <w:noProof w:val="0"/>
+          <w:lang w:val="en-US"/>
+        </w:rPr>
+      </w:pPr>
+      <w:r>
+        <w:rPr>
+          <w:noProof w:val="0"/>
+          <w:lang w:val="en-US"/>
+        </w:rPr>
+        <w:t xml:space="preserve">Designed and developed </w:t>
+      </w:r>
+      <w:r>
+        <w:rPr>
+          <w:noProof w:val="0"/>
+          <w:lang w:val="en-US"/>
+        </w:rPr>
+        <w:t xml:space="preserve">the app </w:t>
+      </w:r>
+      <w:r>
+        <w:rPr>
+          <w:noProof w:val="0"/>
+          <w:lang w:val="en-US"/>
+        </w:rPr>
+        <w:t xml:space="preserve">using Clean Architecture and a multi-module system. </w:t>
+      </w:r>
+    </w:p>
+    <w:p>
+      <w:pPr>
+        <w:pStyle w:val="Bullet2"/>
+        <w:rPr>
+          <w:noProof w:val="0"/>
+          <w:lang w:val="en-US"/>
+        </w:rPr>
+      </w:pPr>
+      <w:r>
+        <w:rPr>
+          <w:noProof w:val="0"/>
+          <w:lang w:val="en-US"/>
+        </w:rPr>
+        <w:t>Implemented MVVM and MVP patterns in the UI layer to enhance maintainability and scalability.</w:t>
+      </w:r>
+    </w:p>
+    <w:p>
+      <w:pPr>
+        <w:pStyle w:val="Bullet2"/>
+        <w:numPr>
+          <w:ilvl w:val="0"/>
+          <w:numId w:val="0"/>
+        </w:numPr>
+        <w:ind w:left="490"/>
+        <w:rPr>
+          <w:noProof w:val="0"/>
+          <w:lang w:val="en-US"/>
+        </w:rPr>
+      </w:pPr>
+    </w:p>
+    <w:p>
+      <w:pPr>
+        <w:pStyle w:val="Normal"/>
+        <w:rPr>
+          <w:b w:val="1"/>
+          <w:bCs w:val="1"/>
+        </w:rPr>
+      </w:pPr>
+      <w:r>
+        <w:rPr>
+          <w:b w:val="1"/>
+          <w:bCs w:val="1"/>
+        </w:rPr>
+        <w:t>Earlier experience</w:t>
+      </w:r>
+    </w:p>
+    <w:p>
+      <w:pPr>
+        <w:pStyle w:val="Bullet2"/>
+        <w:rPr>
+          <w:noProof w:val="0"/>
+          <w:lang w:val="en-US"/>
+        </w:rPr>
+      </w:pPr>
+      <w:r>
+        <w:rPr>
+          <w:noProof w:val="0"/>
+          <w:lang w:val="en-US"/>
+        </w:rPr>
+        <w:t>Android Engineer at Visitech (2017–2019): developed a B2B tablet app for field engineers.</w:t>
+      </w:r>
+    </w:p>
+    <w:p>
+      <w:pPr>
+        <w:pStyle w:val="Bullet2"/>
+        <w:rPr>
+          <w:noProof w:val="0"/>
+          <w:lang w:val="en-US"/>
+        </w:rPr>
+      </w:pPr>
+      <w:r>
+        <w:rPr>
+          <w:noProof w:val="0"/>
+          <w:lang w:val="en-US"/>
+        </w:rPr>
+        <w:t>Android Engineer at Coffice (2016): developed an Android app for ordering coffee capsules.</w:t>
+      </w:r>
+    </w:p>
+    <w:p>
+      <w:pPr>
+        <w:pStyle w:val="Bullet2"/>
+        <w:numPr>
+          <w:ilvl w:val="0"/>
+          <w:numId w:val="0"/>
+        </w:numPr>
+        <w:ind w:left="0"/>
+        <w:rPr>
+          <w:noProof w:val="0"/>
+          <w:lang w:val="en-US"/>
+        </w:rPr>
+      </w:pPr>
+    </w:p>
+    <w:p xmlns:wp14="http://schemas.microsoft.com/office/word/2010/wordml" wp14:textId="21E4225C">
+      <w:pPr>
+        <w:pStyle w:val="Normal"/>
+        <w:ind/>
       </w:pPr>
     </w:p>
     <w:p xmlns:wp14="http://schemas.microsoft.com/office/word/2010/wordml" wp14:textId="77777777">
@@ -1202,79 +1402,71 @@
         <w:t>EDUCATION</w:t>
       </w:r>
     </w:p>
-    <w:p xmlns:wp14="http://schemas.microsoft.com/office/word/2010/wordml" wp14:textId="77777777">
-      <w:pPr>
-        <w:rPr>
-          <w:b/>
-        </w:rPr>
-      </w:pPr>
-      <w:r>
-        <w:rPr>
-          <w:b/>
-        </w:rPr>
-        <w:t>09.</w:t>
-      </w:r>
-      <w:r>
-        <w:rPr>
-          <w:b/>
-        </w:rPr>
-        <w:t xml:space="preserve">2012 </w:t>
-      </w:r>
-      <w:r>
-        <w:rPr>
-          <w:b/>
-          <w:iCs/>
-        </w:rPr>
-        <w:t xml:space="preserve">– </w:t>
-      </w:r>
-      <w:r>
-        <w:rPr>
-          <w:b/>
-          <w:iCs/>
-        </w:rPr>
-        <w:t>07.</w:t>
-      </w:r>
-      <w:r>
-        <w:rPr>
-          <w:b/>
-          <w:iCs/>
-        </w:rPr>
-        <w:t>2018</w:t>
-      </w:r>
-      <w:r>
-        <w:rPr>
-          <w:b/>
-        </w:rPr>
-        <w:t xml:space="preserve"> </w:t>
-      </w:r>
-      <w:r>
-        <w:rPr>
-          <w:b/>
-        </w:rPr>
-        <w:t>Bauman Moscow State Technical University</w:t>
-      </w:r>
-    </w:p>
-    <w:p xmlns:wp14="http://schemas.microsoft.com/office/word/2010/wordml" wp14:textId="77777777">
-      <w:r>
-        <w:t>Specialist of Laser and Optical Technology</w:t>
-      </w:r>
-    </w:p>
-    <w:p xmlns:wp14="http://schemas.microsoft.com/office/word/2010/wordml" wp14:textId="77777777"/>
-    <w:p xmlns:wp14="http://schemas.microsoft.com/office/word/2010/wordml" wp14:textId="77777777">
-      <w:pPr>
-        <w:rPr>
-          <w:b w:val="1"/>
-          <w:bCs w:val="1"/>
-        </w:rPr>
-      </w:pPr>
-      <w:r>
-        <w:rPr>
-          <w:b w:val="1"/>
-          <w:bCs w:val="1"/>
-        </w:rPr>
-        <w:t xml:space="preserve">09.2017 – 12.2017 Technopark </w:t>
-      </w:r>
-      <w:bookmarkStart w:name="_Int_0k7ZQRMC" w:id="1298945444"/>
+    <w:p>
+      <w:pPr>
+        <w:pStyle w:val="Normal"/>
+        <w:rPr>
+          <w:b w:val="1"/>
+          <w:bCs w:val="1"/>
+        </w:rPr>
+      </w:pPr>
+      <w:r>
+        <w:rPr>
+          <w:b w:val="1"/>
+          <w:bCs w:val="1"/>
+        </w:rPr>
+        <w:t>Bauman Moscow State Technical University · 2012–2018 · Russia</w:t>
+      </w:r>
+    </w:p>
+    <w:p>
+      <w:pPr>
+        <w:pStyle w:val="Bullet2"/>
+        <w:rPr>
+          <w:b w:val="1"/>
+          <w:bCs w:val="1"/>
+        </w:rPr>
+      </w:pPr>
+      <w:r>
+        <w:rPr/>
+        <w:t>Specialist (equivalent to M.Eng.) in Laser and Optical Technology</w:t>
+      </w:r>
+    </w:p>
+    <w:p>
+      <w:pPr>
+        <w:pStyle w:val="Bullet2"/>
+        <w:numPr>
+          <w:ilvl w:val="0"/>
+          <w:numId w:val="0"/>
+        </w:numPr>
+        <w:ind w:left="490"/>
+        <w:rPr>
+          <w:b w:val="1"/>
+          <w:bCs w:val="1"/>
+        </w:rPr>
+      </w:pPr>
+    </w:p>
+    <w:p>
+      <w:pPr>
+        <w:pStyle w:val="Bullet2"/>
+        <w:numPr>
+          <w:ilvl w:val="0"/>
+          <w:numId w:val="0"/>
+        </w:numPr>
+        <w:ind w:left="490"/>
+        <w:rPr>
+          <w:b w:val="1"/>
+          <w:bCs w:val="1"/>
+        </w:rPr>
+      </w:pPr>
+    </w:p>
+    <w:p>
+      <w:pPr>
+        <w:pStyle w:val="Normal"/>
+        <w:rPr>
+          <w:b w:val="1"/>
+          <w:bCs w:val="1"/>
+        </w:rPr>
+      </w:pPr>
       <w:r>
         <w:rPr>
           <w:b w:val="1"/>
@@ -1282,130 +1474,17 @@
         </w:rPr>
         <w:t>Mail.Ru</w:t>
       </w:r>
-      <w:bookmarkEnd w:id="1298945444"/>
-      <w:r>
-        <w:rPr>
-          <w:b w:val="1"/>
-          <w:bCs w:val="1"/>
-        </w:rPr>
-        <w:t xml:space="preserve"> Group</w:t>
-      </w:r>
-    </w:p>
-    <w:p xmlns:wp14="http://schemas.microsoft.com/office/word/2010/wordml" wp14:textId="77777777">
-      <w:r>
-        <w:rPr>
-          <w:rFonts w:eastAsia="Tahoma" w:cs="Tahoma"/>
-          <w:sz w:val="22"/>
-          <w:szCs w:val="22"/>
-        </w:rPr>
-        <w:t>Development of iOS applications</w:t>
-      </w:r>
-    </w:p>
-    <w:p xmlns:wp14="http://schemas.microsoft.com/office/word/2010/wordml" wp14:textId="77777777"/>
-    <w:p xmlns:wp14="http://schemas.microsoft.com/office/word/2010/wordml" wp14:textId="77777777">
-      <w:pPr>
-        <w:rPr>
-          <w:b/>
-          <w:bCs/>
-        </w:rPr>
-      </w:pPr>
-      <w:r>
-        <w:rPr>
-          <w:b/>
-          <w:bCs/>
-        </w:rPr>
-        <w:t>02.2015 – 02.2016 Technopark Mail.Ru Group</w:t>
-      </w:r>
-    </w:p>
-    <w:p xmlns:wp14="http://schemas.microsoft.com/office/word/2010/wordml" wp14:textId="77777777">
-      <w:r>
-        <w:t>System</w:t>
-      </w:r>
-      <w:r>
-        <w:t xml:space="preserve"> Architecture</w:t>
-      </w:r>
-    </w:p>
-    <w:p xmlns:wp14="http://schemas.microsoft.com/office/word/2010/wordml" wp14:textId="77777777">
-      <w:pPr>
-        <w:rPr>
-          <w:b/>
-          <w:bCs/>
-        </w:rPr>
-      </w:pPr>
-      <w:r>
-        <w:rPr>
-          <w:b/>
-          <w:bCs/>
-        </w:rPr>
-        <w:t xml:space="preserve">Courses taken: </w:t>
-      </w:r>
-      <w:r>
-        <w:t>Advanced C/C++ development, Algorithms and Data structures</w:t>
-      </w:r>
-      <w:r>
-        <w:rPr>
-          <w:b/>
-          <w:bCs/>
-        </w:rPr>
-        <w:t xml:space="preserve">, </w:t>
-      </w:r>
-      <w:r>
-        <w:t>Java development</w:t>
-      </w:r>
-      <w:r>
-        <w:rPr>
-          <w:b/>
-          <w:bCs/>
-        </w:rPr>
-        <w:t xml:space="preserve">, </w:t>
-      </w:r>
-      <w:r>
-        <w:t>Web technologies</w:t>
-      </w:r>
-      <w:r>
-        <w:rPr>
-          <w:b/>
-          <w:bCs/>
-        </w:rPr>
-        <w:t xml:space="preserve">, </w:t>
-      </w:r>
-      <w:r>
-        <w:t>Frontend development</w:t>
-      </w:r>
-      <w:r>
-        <w:rPr>
-          <w:b/>
-          <w:bCs/>
-        </w:rPr>
-        <w:t xml:space="preserve">, </w:t>
-      </w:r>
-      <w:r>
-        <w:t>Databases</w:t>
-      </w:r>
-      <w:r>
-        <w:rPr>
-          <w:b/>
-          <w:bCs/>
-        </w:rPr>
-        <w:t xml:space="preserve">, </w:t>
-      </w:r>
-      <w:r>
-        <w:t>Development of UI</w:t>
-      </w:r>
-      <w:r>
-        <w:rPr>
-          <w:b/>
-          <w:bCs/>
-        </w:rPr>
-        <w:t xml:space="preserve">, </w:t>
-      </w:r>
-      <w:r>
-        <w:t>Soft Skills</w:t>
-      </w:r>
-    </w:p>
-    <w:p xmlns:wp14="http://schemas.microsoft.com/office/word/2010/wordml" wp14:textId="77777777">
-      <w:pPr>
-        <w:pStyle w:val="Heading1"/>
+      <w:r>
+        <w:rPr>
+          <w:b w:val="1"/>
+          <w:bCs w:val="1"/>
+        </w:rPr>
+        <w:t xml:space="preserve"> Group Technopark · 2015–2017 · Russia</w:t>
+      </w:r>
+    </w:p>
+    <w:p>
+      <w:pPr>
+        <w:pStyle w:val="Bullet2"/>
         <w:rPr>
           <w:noProof w:val="0"/>
           <w:lang w:val="en-US"/>
@@ -1416,316 +1495,21 @@
           <w:noProof w:val="0"/>
           <w:lang w:val="en-US"/>
         </w:rPr>
-        <w:t>SKILLS</w:t>
-      </w:r>
-    </w:p>
-    <w:p xmlns:wp14="http://schemas.microsoft.com/office/word/2010/wordml" wp14:textId="603CCEC3">
-      <w:r>
-        <w:rPr>
-          <w:b w:val="1"/>
-          <w:bCs w:val="1"/>
-        </w:rPr>
-        <w:t>General</w:t>
-      </w:r>
-      <w:r>
-        <w:rPr>
-          <w:b w:val="1"/>
-          <w:bCs w:val="1"/>
-        </w:rPr>
-        <w:t xml:space="preserve">: </w:t>
-      </w:r>
-      <w:r>
-        <w:rPr/>
-        <w:t xml:space="preserve">Java, </w:t>
-      </w:r>
-      <w:r>
-        <w:rPr/>
-        <w:t>Kotlin,</w:t>
-      </w:r>
-      <w:r>
-        <w:rPr/>
-        <w:t xml:space="preserve"> Swift,</w:t>
-      </w:r>
-      <w:r>
-        <w:rPr/>
-        <w:t xml:space="preserve"> </w:t>
-      </w:r>
-      <w:r>
-        <w:rPr/>
-        <w:t xml:space="preserve">C++, </w:t>
-      </w:r>
-      <w:r>
-        <w:rPr/>
-        <w:t>Android SDK 16+, Gradle</w:t>
-      </w:r>
-      <w:r>
-        <w:rPr/>
-        <w:t>, Jetpack Compose, Coroutines</w:t>
-      </w:r>
-      <w:r>
-        <w:rPr/>
-        <w:t xml:space="preserve">, Flow, </w:t>
-      </w:r>
-      <w:r>
-        <w:rPr/>
-        <w:t>Room</w:t>
-      </w:r>
-    </w:p>
-    <w:p xmlns:wp14="http://schemas.microsoft.com/office/word/2010/wordml" wp14:textId="268FFB9B">
-      <w:pPr>
-        <w:pStyle w:val="Normal"/>
-      </w:pPr>
-      <w:r>
-        <w:rPr>
-          <w:b w:val="1"/>
-          <w:bCs w:val="1"/>
-        </w:rPr>
-        <w:t xml:space="preserve">Architecture: </w:t>
-      </w:r>
-      <w:r>
-        <w:rPr/>
-        <w:t>SOLID, KISS, DDD, TDD, C</w:t>
-      </w:r>
-      <w:r>
-        <w:rPr/>
-        <w:t>lean ar</w:t>
-      </w:r>
-      <w:r>
-        <w:rPr/>
-        <w:t xml:space="preserve">chitecture, </w:t>
-      </w:r>
-      <w:r>
-        <w:rPr/>
-        <w:t xml:space="preserve">MVC, </w:t>
-      </w:r>
-      <w:r>
-        <w:rPr/>
-        <w:t>MVP</w:t>
-      </w:r>
-      <w:r>
-        <w:rPr/>
-        <w:t>, MVVM</w:t>
-      </w:r>
-      <w:r>
-        <w:rPr/>
-        <w:t>, MVI</w:t>
-      </w:r>
-      <w:r>
-        <w:rPr/>
-        <w:t>, Multimodule</w:t>
-      </w:r>
-    </w:p>
-    <w:p xmlns:wp14="http://schemas.microsoft.com/office/word/2010/wordml" wp14:textId="29555997">
-      <w:pPr>
-        <w:pStyle w:val="Normal"/>
-      </w:pPr>
-      <w:r>
-        <w:rPr>
-          <w:b w:val="1"/>
-          <w:bCs w:val="1"/>
-        </w:rPr>
-        <w:t>Testing</w:t>
-      </w:r>
-      <w:r>
-        <w:rPr>
-          <w:b w:val="1"/>
-          <w:bCs w:val="1"/>
-        </w:rPr>
-        <w:t xml:space="preserve"> and Automation</w:t>
-      </w:r>
-      <w:r>
-        <w:rPr>
-          <w:b w:val="1"/>
-          <w:bCs w:val="1"/>
-        </w:rPr>
-        <w:t xml:space="preserve">: </w:t>
-      </w:r>
-      <w:r>
-        <w:rPr/>
-        <w:t>jUnit</w:t>
-      </w:r>
-      <w:r>
-        <w:rPr/>
-        <w:t>,</w:t>
-      </w:r>
-      <w:r>
-        <w:rPr/>
-        <w:t xml:space="preserve"> Mockito, </w:t>
-      </w:r>
-      <w:r>
-        <w:rPr/>
-        <w:t xml:space="preserve">Espresso, </w:t>
-      </w:r>
-      <w:r>
-        <w:rPr/>
-        <w:t>Kaspresso</w:t>
-      </w:r>
-      <w:r>
-        <w:rPr/>
-        <w:t xml:space="preserve">, </w:t>
-      </w:r>
-      <w:r>
-        <w:rPr/>
-        <w:t>LeakCanary,</w:t>
-      </w:r>
-      <w:r>
-        <w:rPr>
-          <w:b w:val="1"/>
-          <w:bCs w:val="1"/>
-        </w:rPr>
-        <w:t xml:space="preserve"> </w:t>
-      </w:r>
-      <w:r>
-        <w:rPr/>
-        <w:t>Jenkins,</w:t>
-      </w:r>
-      <w:r>
-        <w:rPr/>
-        <w:t xml:space="preserve"> </w:t>
-      </w:r>
-      <w:r>
-        <w:rPr/>
-        <w:t>TeamCity</w:t>
-      </w:r>
-    </w:p>
-    <w:p xmlns:wp14="http://schemas.microsoft.com/office/word/2010/wordml" wp14:textId="77777777">
-      <w:pPr>
-        <w:pStyle w:val="Heading1"/>
-        <w:rPr>
-          <w:b/>
-          <w:lang w:val="de-AT"/>
-        </w:rPr>
-      </w:pPr>
+        <w:t xml:space="preserve">System Architecture &amp; </w:t>
+      </w:r>
       <w:r>
         <w:rPr>
           <w:noProof w:val="0"/>
           <w:lang w:val="en-US"/>
         </w:rPr>
-        <w:t>LANGUAGE</w:t>
-      </w:r>
-    </w:p>
-    <w:p xmlns:wp14="http://schemas.microsoft.com/office/word/2010/wordml" wp14:textId="2C19DE71">
-      <w:pPr>
-        <w:rPr>
-          <w:lang w:val="de-AT"/>
-        </w:rPr>
-      </w:pPr>
-      <w:r>
-        <w:rPr/>
-        <w:t>Russian</w:t>
-      </w:r>
-      <w:r>
-        <w:rPr>
-          <w:lang w:val="de-AT"/>
-        </w:rPr>
-        <w:t xml:space="preserve"> – C2</w:t>
-      </w:r>
-      <w:r>
-        <w:rPr>
-          <w:sz w:val="20"/>
-          <w:szCs w:val="20"/>
-          <w:lang w:val="de-AT"/>
-        </w:rPr>
-        <w:t xml:space="preserve"> </w:t>
-      </w:r>
-    </w:p>
-    <w:p xmlns:wp14="http://schemas.microsoft.com/office/word/2010/wordml" wp14:textId="1C5F7AFA">
-      <w:pPr>
-        <w:rPr>
-          <w:sz w:val="20"/>
-          <w:szCs w:val="20"/>
-          <w:lang w:val="de-AT"/>
-        </w:rPr>
-      </w:pPr>
-      <w:r>
-        <w:rPr>
-          <w:sz w:val="20"/>
-          <w:szCs w:val="20"/>
-          <w:lang w:val="de-AT"/>
-        </w:rPr>
-        <w:t>English –</w:t>
-      </w:r>
-      <w:r>
-        <w:rPr>
-          <w:sz w:val="20"/>
-          <w:szCs w:val="20"/>
-          <w:lang w:val="de-AT"/>
-        </w:rPr>
-        <w:t xml:space="preserve"> </w:t>
-      </w:r>
-      <w:r>
-        <w:rPr>
-          <w:sz w:val="20"/>
-          <w:szCs w:val="20"/>
-          <w:lang w:val="de-AT"/>
-        </w:rPr>
-        <w:t>B2/C1</w:t>
-      </w:r>
-    </w:p>
-    <w:p xmlns:wp14="http://schemas.microsoft.com/office/word/2010/wordml" wp14:textId="178EBBA9">
-      <w:pPr>
-        <w:pStyle w:val="Normal"/>
-        <w:rPr>
-          <w:sz w:val="20"/>
-          <w:szCs w:val="20"/>
-          <w:lang w:val="de-AT"/>
-        </w:rPr>
-      </w:pPr>
-      <w:r>
-        <w:rPr>
-          <w:rFonts w:eastAsia="Tahoma" w:cs="Tahoma"/>
-          <w:sz w:val="20"/>
-          <w:szCs w:val="20"/>
-          <w:lang w:val="de-AT"/>
-        </w:rPr>
-        <w:t>Spanish</w:t>
-      </w:r>
-      <w:r>
-        <w:rPr>
-          <w:rFonts w:eastAsia="Tahoma" w:cs="Tahoma"/>
-          <w:sz w:val="20"/>
-          <w:szCs w:val="20"/>
-          <w:lang w:val="de-AT"/>
-        </w:rPr>
-        <w:t>/</w:t>
-      </w:r>
-      <w:r>
-        <w:rPr>
-          <w:rFonts w:eastAsia="Tahoma" w:cs="Tahoma"/>
-          <w:sz w:val="20"/>
-          <w:szCs w:val="20"/>
-          <w:lang w:val="de-AT"/>
-        </w:rPr>
-        <w:t>Portuguese</w:t>
-      </w:r>
-      <w:r>
-        <w:rPr>
-          <w:rFonts w:eastAsia="Tahoma" w:cs="Tahoma"/>
-          <w:sz w:val="20"/>
-          <w:szCs w:val="20"/>
-          <w:lang w:val="de-AT"/>
-        </w:rPr>
-        <w:t xml:space="preserve"> </w:t>
-      </w:r>
-      <w:r>
-        <w:rPr>
-          <w:sz w:val="20"/>
-          <w:szCs w:val="20"/>
-          <w:lang w:val="de-AT"/>
-        </w:rPr>
-        <w:t xml:space="preserve">– </w:t>
-      </w:r>
-      <w:r>
-        <w:rPr>
-          <w:rFonts w:eastAsia="Tahoma" w:cs="Tahoma"/>
-          <w:sz w:val="20"/>
-          <w:szCs w:val="20"/>
-          <w:lang w:val="de-AT"/>
-        </w:rPr>
-        <w:t>A1</w:t>
-      </w:r>
-      <w:r>
-        <w:br/>
+        <w:t xml:space="preserve">Mobile </w:t>
+      </w:r>
+      <w:r>
+        <w:rPr>
+          <w:noProof w:val="0"/>
+          <w:lang w:val="en-US"/>
+        </w:rPr>
+        <w:t xml:space="preserve">Development programs </w:t>
       </w:r>
     </w:p>
     <w:sectPr>
@@ -2046,6 +1830,230 @@
 
 <file path=word/numbering.xml><?xml version="1.0" encoding="utf-8"?>
 <w:numbering xmlns:wpc="http://schemas.microsoft.com/office/word/2010/wordprocessingCanvas" xmlns:cx="http://schemas.microsoft.com/office/drawing/2014/chartex" xmlns:cx1="http://schemas.microsoft.com/office/drawing/2015/9/8/chartex" xmlns:cx2="http://schemas.microsoft.com/office/drawing/2015/10/21/chartex" xmlns:cx3="http://schemas.microsoft.com/office/drawing/2016/5/9/chartex" xmlns:cx4="http://schemas.microsoft.com/office/drawing/2016/5/10/chartex" xmlns:cx5="http://schemas.microsoft.com/office/drawing/2016/5/11/chartex" xmlns:cx6="http://schemas.microsoft.com/office/drawing/2016/5/12/chartex" xmlns:cx7="http://schemas.microsoft.com/office/drawing/2016/5/13/chartex" xmlns:cx8="http://schemas.microsoft.com/office/drawing/2016/5/14/chartex" xmlns:mc="http://schemas.openxmlformats.org/markup-compatibility/2006" xmlns:aink="http://schemas.microsoft.com/office/drawing/2016/ink" xmlns:am3d="http://schemas.microsoft.com/office/drawing/2017/model3d" xmlns:o="urn:schemas-microsoft-com:office:office" xmlns:oel="http://schemas.microsoft.com/office/2019/extlst" xmlns:r="http://schemas.openxmlformats.org/officeDocument/2006/relationships" xmlns:m="http://schemas.openxmlformats.org/officeDocument/2006/math" xmlns:v="urn:schemas-microsoft-com:vml" xmlns:wp14="http://schemas.microsoft.com/office/word/2010/wordprocessingDrawing" xmlns:wp="http://schemas.openxmlformats.org/drawingml/2006/wordprocessingDrawing" xmlns:w10="urn:schemas-microsoft-com:office:word" xmlns:w="http://schemas.openxmlformats.org/wordprocessingml/2006/main" xmlns:w14="http://schemas.microsoft.com/office/word/2010/wordml" xmlns:w15="http://schemas.microsoft.com/office/word/2012/wordml" xmlns:w16cex="http://schemas.microsoft.com/office/word/2018/wordml/cex" xmlns:w16cid="http://schemas.microsoft.com/office/word/2016/wordml/cid" xmlns:w16="http://schemas.microsoft.com/office/word/2018/wordml" xmlns:w16sdtdh="http://schemas.microsoft.com/office/word/2020/wordml/sdtdatahash" xmlns:w16se="http://schemas.microsoft.com/office/word/2015/wordml/symex" xmlns:wpg="http://schemas.microsoft.com/office/word/2010/wordprocessingGroup" xmlns:wpi="http://schemas.microsoft.com/office/word/2010/wordprocessingInk" xmlns:wne="http://schemas.microsoft.com/office/word/2006/wordml" xmlns:wps="http://schemas.microsoft.com/office/word/2010/wordprocessingShape" mc:Ignorable="w14 w15 w16se w16cid w16 w16cex w16sdtdh wp14">
+  <w:abstractNum xmlns:w="http://schemas.openxmlformats.org/wordprocessingml/2006/main" w:abstractNumId="15">
+    <w:nsid w:val="1a35d1d2"/>
+    <w:multiLevelType xmlns:w="http://schemas.openxmlformats.org/wordprocessingml/2006/main" w:val="hybridMultilevel"/>
+    <w:lvl xmlns:w="http://schemas.openxmlformats.org/wordprocessingml/2006/main" w:ilvl="0">
+      <w:start w:val="1"/>
+      <w:numFmt w:val="bullet"/>
+      <w:lvlText w:val=""/>
+      <w:lvlJc w:val="left"/>
+      <w:pPr>
+        <w:ind w:left="720" w:hanging="360"/>
+      </w:pPr>
+      <w:rPr>
+        <w:rFonts w:hint="default" w:ascii="Symbol" w:hAnsi="Symbol"/>
+      </w:rPr>
+    </w:lvl>
+    <w:lvl xmlns:w="http://schemas.openxmlformats.org/wordprocessingml/2006/main" w:ilvl="1">
+      <w:start w:val="1"/>
+      <w:numFmt w:val="bullet"/>
+      <w:lvlText w:val="o"/>
+      <w:lvlJc w:val="left"/>
+      <w:pPr>
+        <w:ind w:left="1440" w:hanging="360"/>
+      </w:pPr>
+      <w:rPr>
+        <w:rFonts w:hint="default" w:ascii="Courier New" w:hAnsi="Courier New"/>
+      </w:rPr>
+    </w:lvl>
+    <w:lvl xmlns:w="http://schemas.openxmlformats.org/wordprocessingml/2006/main" w:ilvl="2">
+      <w:start w:val="1"/>
+      <w:numFmt w:val="bullet"/>
+      <w:lvlText w:val=""/>
+      <w:lvlJc w:val="left"/>
+      <w:pPr>
+        <w:ind w:left="2160" w:hanging="360"/>
+      </w:pPr>
+      <w:rPr>
+        <w:rFonts w:hint="default" w:ascii="Wingdings" w:hAnsi="Wingdings"/>
+      </w:rPr>
+    </w:lvl>
+    <w:lvl xmlns:w="http://schemas.openxmlformats.org/wordprocessingml/2006/main" w:ilvl="3">
+      <w:start w:val="1"/>
+      <w:numFmt w:val="bullet"/>
+      <w:lvlText w:val=""/>
+      <w:lvlJc w:val="left"/>
+      <w:pPr>
+        <w:ind w:left="2880" w:hanging="360"/>
+      </w:pPr>
+      <w:rPr>
+        <w:rFonts w:hint="default" w:ascii="Symbol" w:hAnsi="Symbol"/>
+      </w:rPr>
+    </w:lvl>
+    <w:lvl xmlns:w="http://schemas.openxmlformats.org/wordprocessingml/2006/main" w:ilvl="4">
+      <w:start w:val="1"/>
+      <w:numFmt w:val="bullet"/>
+      <w:lvlText w:val="o"/>
+      <w:lvlJc w:val="left"/>
+      <w:pPr>
+        <w:ind w:left="3600" w:hanging="360"/>
+      </w:pPr>
+      <w:rPr>
+        <w:rFonts w:hint="default" w:ascii="Courier New" w:hAnsi="Courier New"/>
+      </w:rPr>
+    </w:lvl>
+    <w:lvl xmlns:w="http://schemas.openxmlformats.org/wordprocessingml/2006/main" w:ilvl="5">
+      <w:start w:val="1"/>
+      <w:numFmt w:val="bullet"/>
+      <w:lvlText w:val=""/>
+      <w:lvlJc w:val="left"/>
+      <w:pPr>
+        <w:ind w:left="4320" w:hanging="360"/>
+      </w:pPr>
+      <w:rPr>
+        <w:rFonts w:hint="default" w:ascii="Wingdings" w:hAnsi="Wingdings"/>
+      </w:rPr>
+    </w:lvl>
+    <w:lvl xmlns:w="http://schemas.openxmlformats.org/wordprocessingml/2006/main" w:ilvl="6">
+      <w:start w:val="1"/>
+      <w:numFmt w:val="bullet"/>
+      <w:lvlText w:val=""/>
+      <w:lvlJc w:val="left"/>
+      <w:pPr>
+        <w:ind w:left="5040" w:hanging="360"/>
+      </w:pPr>
+      <w:rPr>
+        <w:rFonts w:hint="default" w:ascii="Symbol" w:hAnsi="Symbol"/>
+      </w:rPr>
+    </w:lvl>
+    <w:lvl xmlns:w="http://schemas.openxmlformats.org/wordprocessingml/2006/main" w:ilvl="7">
+      <w:start w:val="1"/>
+      <w:numFmt w:val="bullet"/>
+      <w:lvlText w:val="o"/>
+      <w:lvlJc w:val="left"/>
+      <w:pPr>
+        <w:ind w:left="5760" w:hanging="360"/>
+      </w:pPr>
+      <w:rPr>
+        <w:rFonts w:hint="default" w:ascii="Courier New" w:hAnsi="Courier New"/>
+      </w:rPr>
+    </w:lvl>
+    <w:lvl xmlns:w="http://schemas.openxmlformats.org/wordprocessingml/2006/main" w:ilvl="8">
+      <w:start w:val="1"/>
+      <w:numFmt w:val="bullet"/>
+      <w:lvlText w:val=""/>
+      <w:lvlJc w:val="left"/>
+      <w:pPr>
+        <w:ind w:left="6480" w:hanging="360"/>
+      </w:pPr>
+      <w:rPr>
+        <w:rFonts w:hint="default" w:ascii="Wingdings" w:hAnsi="Wingdings"/>
+      </w:rPr>
+    </w:lvl>
+  </w:abstractNum>
+  <w:abstractNum xmlns:w="http://schemas.openxmlformats.org/wordprocessingml/2006/main" w:abstractNumId="14">
+    <w:nsid w:val="1bb4e129"/>
+    <w:multiLevelType xmlns:w="http://schemas.openxmlformats.org/wordprocessingml/2006/main" w:val="hybridMultilevel"/>
+    <w:lvl xmlns:w="http://schemas.openxmlformats.org/wordprocessingml/2006/main" w:ilvl="0">
+      <w:start w:val="1"/>
+      <w:numFmt w:val="bullet"/>
+      <w:lvlText w:val="-"/>
+      <w:lvlJc w:val="left"/>
+      <w:pPr>
+        <w:ind w:left="720" w:hanging="360"/>
+      </w:pPr>
+      <w:rPr>
+        <w:rFonts w:hint="default" w:ascii="Aptos" w:hAnsi="Aptos"/>
+      </w:rPr>
+    </w:lvl>
+    <w:lvl xmlns:w="http://schemas.openxmlformats.org/wordprocessingml/2006/main" w:ilvl="1">
+      <w:start w:val="1"/>
+      <w:numFmt w:val="bullet"/>
+      <w:lvlText w:val="o"/>
+      <w:lvlJc w:val="left"/>
+      <w:pPr>
+        <w:ind w:left="1440" w:hanging="360"/>
+      </w:pPr>
+      <w:rPr>
+        <w:rFonts w:hint="default" w:ascii="Courier New" w:hAnsi="Courier New"/>
+      </w:rPr>
+    </w:lvl>
+    <w:lvl xmlns:w="http://schemas.openxmlformats.org/wordprocessingml/2006/main" w:ilvl="2">
+      <w:start w:val="1"/>
+      <w:numFmt w:val="bullet"/>
+      <w:lvlText w:val=""/>
+      <w:lvlJc w:val="left"/>
+      <w:pPr>
+        <w:ind w:left="2160" w:hanging="360"/>
+      </w:pPr>
+      <w:rPr>
+        <w:rFonts w:hint="default" w:ascii="Wingdings" w:hAnsi="Wingdings"/>
+      </w:rPr>
+    </w:lvl>
+    <w:lvl xmlns:w="http://schemas.openxmlformats.org/wordprocessingml/2006/main" w:ilvl="3">
+      <w:start w:val="1"/>
+      <w:numFmt w:val="bullet"/>
+      <w:lvlText w:val=""/>
+      <w:lvlJc w:val="left"/>
+      <w:pPr>
+        <w:ind w:left="2880" w:hanging="360"/>
+      </w:pPr>
+      <w:rPr>
+        <w:rFonts w:hint="default" w:ascii="Symbol" w:hAnsi="Symbol"/>
+      </w:rPr>
+    </w:lvl>
+    <w:lvl xmlns:w="http://schemas.openxmlformats.org/wordprocessingml/2006/main" w:ilvl="4">
+      <w:start w:val="1"/>
+      <w:numFmt w:val="bullet"/>
+      <w:lvlText w:val="o"/>
+      <w:lvlJc w:val="left"/>
+      <w:pPr>
+        <w:ind w:left="3600" w:hanging="360"/>
+      </w:pPr>
+      <w:rPr>
+        <w:rFonts w:hint="default" w:ascii="Courier New" w:hAnsi="Courier New"/>
+      </w:rPr>
+    </w:lvl>
+    <w:lvl xmlns:w="http://schemas.openxmlformats.org/wordprocessingml/2006/main" w:ilvl="5">
+      <w:start w:val="1"/>
+      <w:numFmt w:val="bullet"/>
+      <w:lvlText w:val=""/>
+      <w:lvlJc w:val="left"/>
+      <w:pPr>
+        <w:ind w:left="4320" w:hanging="360"/>
+      </w:pPr>
+      <w:rPr>
+        <w:rFonts w:hint="default" w:ascii="Wingdings" w:hAnsi="Wingdings"/>
+      </w:rPr>
+    </w:lvl>
+    <w:lvl xmlns:w="http://schemas.openxmlformats.org/wordprocessingml/2006/main" w:ilvl="6">
+      <w:start w:val="1"/>
+      <w:numFmt w:val="bullet"/>
+      <w:lvlText w:val=""/>
+      <w:lvlJc w:val="left"/>
+      <w:pPr>
+        <w:ind w:left="5040" w:hanging="360"/>
+      </w:pPr>
+      <w:rPr>
+        <w:rFonts w:hint="default" w:ascii="Symbol" w:hAnsi="Symbol"/>
+      </w:rPr>
+    </w:lvl>
+    <w:lvl xmlns:w="http://schemas.openxmlformats.org/wordprocessingml/2006/main" w:ilvl="7">
+      <w:start w:val="1"/>
+      <w:numFmt w:val="bullet"/>
+      <w:lvlText w:val="o"/>
+      <w:lvlJc w:val="left"/>
+      <w:pPr>
+        <w:ind w:left="5760" w:hanging="360"/>
+      </w:pPr>
+      <w:rPr>
+        <w:rFonts w:hint="default" w:ascii="Courier New" w:hAnsi="Courier New"/>
+      </w:rPr>
+    </w:lvl>
+    <w:lvl xmlns:w="http://schemas.openxmlformats.org/wordprocessingml/2006/main" w:ilvl="8">
+      <w:start w:val="1"/>
+      <w:numFmt w:val="bullet"/>
+      <w:lvlText w:val=""/>
+      <w:lvlJc w:val="left"/>
+      <w:pPr>
+        <w:ind w:left="6480" w:hanging="360"/>
+      </w:pPr>
+      <w:rPr>
+        <w:rFonts w:hint="default" w:ascii="Wingdings" w:hAnsi="Wingdings"/>
+      </w:rPr>
+    </w:lvl>
+  </w:abstractNum>
   <w:abstractNum w:abstractNumId="0" w15:restartNumberingAfterBreak="0">
     <w:nsid w:val="01037C29"/>
     <w:multiLevelType w:val="hybridMultilevel"/>
@@ -3699,6 +3707,12 @@
       </w:rPr>
     </w:lvl>
   </w:abstractNum>
+  <w:num w:numId="24">
+    <w:abstractNumId w:val="15"/>
+  </w:num>
+  <w:num w:numId="23">
+    <w:abstractNumId w:val="14"/>
+  </w:num>
   <w:num w:numId="1" w16cid:durableId="519125490">
     <w:abstractNumId w:val="6"/>
   </w:num>
@@ -5117,7 +5131,7 @@
 </file>
 
 <file path=word/theme/theme1.xml><?xml version="1.0" encoding="utf-8"?>
-<a:theme xmlns:a="http://schemas.openxmlformats.org/drawingml/2006/main" name="Office Theme">
+<a:theme xmlns:a="http://schemas.openxmlformats.org/drawingml/2006/main" xmlns:thm15="http://schemas.microsoft.com/office/thememl/2012/main" name="Office Theme">
   <a:themeElements>
     <a:clrScheme name="Office">
       <a:dk1>

</xml_diff>